<commit_message>
Fill in verified bibliographic details for several sources
Padan is an article in Maasei Mishpat 13 at 411 (2022); Podam, Derri and
Toledano appears in Maasei Mishpat 14 (2023); Harmelin's chapter is in
"75 שנות עצמאות במשפט" (Barak-Erez ed., 2023); "קרימינולוגיה ישראלית" is
a journal, so Amitai and Vilmovsky is cited as an article.

Co-Authored-By: Claude Opus 5.5 <noreply@anthropic.com>
Claude-Session: https://claude.ai/code/session_01E28rxLu3Wa1kQRJF5nPNrT
</commit_message>
<xml_diff>
--- a/academic/seminar/seminar.docx
+++ b/academic/seminar/seminar.docx
@@ -7289,6 +7289,25 @@
           <w:shd w:fill="FFF200" w:color="auto" w:val="clear"/>
           <w:rtl/>
         </w:rPr>
+        <w:t xml:space="preserve">[כרך]</w:t>
+      </w:r>
+      <w:r>
+        <w:rPr>
+          <w:rFonts w:ascii="David" w:cs="David" w:eastAsia="David" w:hAnsi="David"/>
+          <w:sz w:val="20"/>
+          <w:szCs w:val="20"/>
+          <w:rtl/>
+        </w:rPr>
+        <w:t xml:space="preserve"> </w:t>
+      </w:r>
+      <w:r>
+        <w:rPr>
+          <w:rFonts w:ascii="David" w:cs="David" w:eastAsia="David" w:hAnsi="David"/>
+          <w:sz w:val="20"/>
+          <w:szCs w:val="20"/>
+          <w:shd w:fill="FFF200" w:color="auto" w:val="clear"/>
+          <w:rtl/>
+        </w:rPr>
         <w:t xml:space="preserve">[עמוד]</w:t>
       </w:r>
       <w:r>
@@ -7296,28 +7315,9 @@
           <w:rFonts w:ascii="David" w:cs="David" w:eastAsia="David" w:hAnsi="David"/>
           <w:sz w:val="20"/>
           <w:szCs w:val="20"/>
-          <w:rtl/>
-        </w:rPr>
-        <w:t xml:space="preserve"> (</w:t>
-      </w:r>
-      <w:r>
-        <w:rPr>
-          <w:rFonts w:ascii="David" w:cs="David" w:eastAsia="David" w:hAnsi="David"/>
-          <w:sz w:val="20"/>
-          <w:szCs w:val="20"/>
-          <w:shd w:fill="FFF200" w:color="auto" w:val="clear"/>
-          <w:rtl/>
-        </w:rPr>
-        <w:t xml:space="preserve">[עורכים]</w:t>
-      </w:r>
-      <w:r>
-        <w:rPr>
-          <w:rFonts w:ascii="David" w:cs="David" w:eastAsia="David" w:hAnsi="David"/>
-          <w:sz w:val="20"/>
-          <w:szCs w:val="20"/>
-          <w:rtl w:val="false"/>
-        </w:rPr>
-        <w:t xml:space="preserve">, 2022).</w:t>
+          <w:rtl w:val="false"/>
+        </w:rPr>
+        <w:t xml:space="preserve"> (2022).</w:t>
       </w:r>
     </w:p>
   </w:footnote>
@@ -8843,7 +8843,7 @@
           <w:szCs w:val="20"/>
           <w:rtl/>
         </w:rPr>
-        <w:t xml:space="preserve">75 שנות עצמאות במשפט</w:t>
+        <w:t xml:space="preserve">75 שנות עצמאות במשפט: שופטים מספרים על פסקי דין משבעים וחמש שנות שפיטה</w:t>
       </w:r>
       <w:r>
         <w:rPr>
@@ -8871,26 +8871,7 @@
           <w:szCs w:val="20"/>
           <w:rtl/>
         </w:rPr>
-        <w:t xml:space="preserve"> (</w:t>
-      </w:r>
-      <w:r>
-        <w:rPr>
-          <w:rFonts w:ascii="David" w:cs="David" w:eastAsia="David" w:hAnsi="David"/>
-          <w:sz w:val="20"/>
-          <w:szCs w:val="20"/>
-          <w:shd w:fill="FFF200" w:color="auto" w:val="clear"/>
-          <w:rtl/>
-        </w:rPr>
-        <w:t xml:space="preserve">[עורכים]</w:t>
-      </w:r>
-      <w:r>
-        <w:rPr>
-          <w:rFonts w:ascii="David" w:cs="David" w:eastAsia="David" w:hAnsi="David"/>
-          <w:sz w:val="20"/>
-          <w:szCs w:val="20"/>
-          <w:rtl w:val="false"/>
-        </w:rPr>
-        <w:t xml:space="preserve">, 2023).</w:t>
+        <w:t xml:space="preserve"> (דפנה ברק-ארז עורכת ראשית, 2023).</w:t>
       </w:r>
     </w:p>
   </w:footnote>
@@ -9310,7 +9291,7 @@
           <w:szCs w:val="20"/>
           <w:rtl/>
         </w:rPr>
-        <w:t xml:space="preserve"> ארז פדן </w:t>
+        <w:t xml:space="preserve"> ארז פדן "פרקליטות 3.0: הפרקליטות כפי שהייתה, כפי שהינה וכפי שצריכה להיות" </w:t>
       </w:r>
       <w:r>
         <w:rPr>
@@ -9321,35 +9302,16 @@
           <w:szCs w:val="20"/>
           <w:rtl/>
         </w:rPr>
-        <w:t xml:space="preserve">פרקליטות 3.0: הפרקליטות כפי שהייתה, כפי שהינה וכפי שצריכה להיות</w:t>
-      </w:r>
-      <w:r>
-        <w:rPr>
-          <w:rFonts w:ascii="David" w:cs="David" w:eastAsia="David" w:hAnsi="David"/>
-          <w:sz w:val="20"/>
-          <w:szCs w:val="20"/>
-          <w:rtl/>
-        </w:rPr>
-        <w:t xml:space="preserve"> </w:t>
-      </w:r>
-      <w:r>
-        <w:rPr>
-          <w:rFonts w:ascii="David" w:cs="David" w:eastAsia="David" w:hAnsi="David"/>
-          <w:sz w:val="20"/>
-          <w:szCs w:val="20"/>
-          <w:shd w:fill="FFF200" w:color="auto" w:val="clear"/>
-          <w:rtl/>
-        </w:rPr>
-        <w:t xml:space="preserve">[עמוד]</w:t>
-      </w:r>
-      <w:r>
-        <w:rPr>
-          <w:rFonts w:ascii="David" w:cs="David" w:eastAsia="David" w:hAnsi="David"/>
-          <w:sz w:val="20"/>
-          <w:szCs w:val="20"/>
-          <w:rtl w:val="false"/>
-        </w:rPr>
-        <w:t xml:space="preserve"> (2022).</w:t>
+        <w:t xml:space="preserve">מעשי משפט</w:t>
+      </w:r>
+      <w:r>
+        <w:rPr>
+          <w:rFonts w:ascii="David" w:cs="David" w:eastAsia="David" w:hAnsi="David"/>
+          <w:sz w:val="20"/>
+          <w:szCs w:val="20"/>
+          <w:rtl/>
+        </w:rPr>
+        <w:t xml:space="preserve"> יג 411 (2022).</w:t>
       </w:r>
     </w:p>
   </w:footnote>
@@ -11264,26 +11226,7 @@
           <w:szCs w:val="20"/>
           <w:rtl/>
         </w:rPr>
-        <w:t xml:space="preserve"> </w:t>
-      </w:r>
-      <w:r>
-        <w:rPr>
-          <w:rFonts w:ascii="David" w:cs="David" w:eastAsia="David" w:hAnsi="David"/>
-          <w:sz w:val="20"/>
-          <w:szCs w:val="20"/>
-          <w:shd w:fill="FFF200" w:color="auto" w:val="clear"/>
-          <w:rtl/>
-        </w:rPr>
-        <w:t xml:space="preserve">[כרך]</w:t>
-      </w:r>
-      <w:r>
-        <w:rPr>
-          <w:rFonts w:ascii="David" w:cs="David" w:eastAsia="David" w:hAnsi="David"/>
-          <w:sz w:val="20"/>
-          <w:szCs w:val="20"/>
-          <w:rtl/>
-        </w:rPr>
-        <w:t xml:space="preserve"> </w:t>
+        <w:t xml:space="preserve"> יד </w:t>
       </w:r>
       <w:r>
         <w:rPr>

</xml_diff>

<commit_message>
Add verified pinpoints from Padan and Podam et al. articles
Podam, Derri and Toledano starts at Maasei Mishpat 14, 195; cite pages
206, 209 and 220. Pin Padan to page 430 and note 67, and add his remark
that no parallel program was built in the prosecution service.

Co-Authored-By: Claude Opus 5.5 <noreply@anthropic.com>
Claude-Session: https://claude.ai/code/session_01E28rxLu3Wa1kQRJF5nPNrT
</commit_message>
<xml_diff>
--- a/academic/seminar/seminar.docx
+++ b/academic/seminar/seminar.docx
@@ -3106,13 +3106,28 @@
           <w:szCs w:val="24"/>
           <w:rtl/>
         </w:rPr>
+        <w:t xml:space="preserve"> פודם ועמיתיה מוסיפים שבשונה מן האזרחים, שוטרים סבורים שלגיטימיות המשטרה נובעת בעיקר מביצועיה בפועל, ושהוגנות הדרך שבה הם פועלים היא גורם משני.</w:t>
+      </w:r>
+      <w:r>
+        <w:rPr>
+          <w:rStyle w:val="FootnoteReference"/>
+        </w:rPr>
+        <w:footnoteReference w:id="118"/>
+      </w:r>
+      <w:r>
+        <w:rPr>
+          <w:rFonts w:ascii="David" w:cs="David" w:eastAsia="David" w:hAnsi="David"/>
+          <w:sz w:val="24"/>
+          <w:szCs w:val="24"/>
+          <w:rtl/>
+        </w:rPr>
         <w:t xml:space="preserve"> גם ההגנה על מי שמוסר מידע מוגבלת: ברק-ארז מראה שבתי המשפט הגנו בעיקר על זהותם של מודיעים משטרתיים,</w:t>
       </w:r>
       <w:r>
         <w:rPr>
           <w:rStyle w:val="FootnoteReference"/>
         </w:rPr>
-        <w:footnoteReference w:id="118"/>
+        <w:footnoteReference w:id="119"/>
       </w:r>
       <w:r>
         <w:rPr>
@@ -3127,7 +3142,7 @@
         <w:rPr>
           <w:rStyle w:val="FootnoteReference"/>
         </w:rPr>
-        <w:footnoteReference w:id="119"/>
+        <w:footnoteReference w:id="120"/>
       </w:r>
       <w:r>
         <w:rPr>
@@ -3142,7 +3157,7 @@
         <w:rPr>
           <w:rStyle w:val="FootnoteReference"/>
         </w:rPr>
-        <w:footnoteReference w:id="120"/>
+        <w:footnoteReference w:id="121"/>
       </w:r>
       <w:r>
         <w:rPr>
@@ -3157,7 +3172,7 @@
         <w:rPr>
           <w:rStyle w:val="FootnoteReference"/>
         </w:rPr>
-        <w:footnoteReference w:id="121"/>
+        <w:footnoteReference w:id="122"/>
       </w:r>
       <w:r>
         <w:rPr>
@@ -3172,7 +3187,7 @@
         <w:rPr>
           <w:rStyle w:val="FootnoteReference"/>
         </w:rPr>
-        <w:footnoteReference w:id="122"/>
+        <w:footnoteReference w:id="123"/>
       </w:r>
       <w:r>
         <w:rPr>
@@ -3242,7 +3257,7 @@
         <w:rPr>
           <w:rStyle w:val="FootnoteReference"/>
         </w:rPr>
-        <w:footnoteReference w:id="123"/>
+        <w:footnoteReference w:id="124"/>
       </w:r>
       <w:r>
         <w:rPr>
@@ -3257,7 +3272,7 @@
         <w:rPr>
           <w:rStyle w:val="FootnoteReference"/>
         </w:rPr>
-        <w:footnoteReference w:id="124"/>
+        <w:footnoteReference w:id="125"/>
       </w:r>
       <w:r>
         <w:rPr>
@@ -3272,7 +3287,7 @@
         <w:rPr>
           <w:rStyle w:val="FootnoteReference"/>
         </w:rPr>
-        <w:footnoteReference w:id="125"/>
+        <w:footnoteReference w:id="126"/>
       </w:r>
     </w:p>
     <w:p>
@@ -3295,7 +3310,7 @@
         <w:rPr>
           <w:rStyle w:val="FootnoteReference"/>
         </w:rPr>
-        <w:footnoteReference w:id="126"/>
+        <w:footnoteReference w:id="127"/>
       </w:r>
       <w:r>
         <w:rPr>
@@ -3310,7 +3325,7 @@
         <w:rPr>
           <w:rStyle w:val="FootnoteReference"/>
         </w:rPr>
-        <w:footnoteReference w:id="127"/>
+        <w:footnoteReference w:id="128"/>
       </w:r>
       <w:r>
         <w:rPr>
@@ -3325,7 +3340,7 @@
         <w:rPr>
           <w:rStyle w:val="FootnoteReference"/>
         </w:rPr>
-        <w:footnoteReference w:id="128"/>
+        <w:footnoteReference w:id="129"/>
       </w:r>
     </w:p>
     <w:p>
@@ -3367,7 +3382,7 @@
         <w:rPr>
           <w:rStyle w:val="FootnoteReference"/>
         </w:rPr>
-        <w:footnoteReference w:id="129"/>
+        <w:footnoteReference w:id="130"/>
       </w:r>
       <w:r>
         <w:rPr>
@@ -3382,7 +3397,7 @@
         <w:rPr>
           <w:rStyle w:val="FootnoteReference"/>
         </w:rPr>
-        <w:footnoteReference w:id="130"/>
+        <w:footnoteReference w:id="131"/>
       </w:r>
     </w:p>
     <w:p>
@@ -3405,7 +3420,7 @@
         <w:rPr>
           <w:rStyle w:val="FootnoteReference"/>
         </w:rPr>
-        <w:footnoteReference w:id="131"/>
+        <w:footnoteReference w:id="132"/>
       </w:r>
       <w:r>
         <w:rPr>
@@ -3420,7 +3435,7 @@
         <w:rPr>
           <w:rStyle w:val="FootnoteReference"/>
         </w:rPr>
-        <w:footnoteReference w:id="132"/>
+        <w:footnoteReference w:id="133"/>
       </w:r>
       <w:r>
         <w:rPr>
@@ -3435,7 +3450,7 @@
         <w:rPr>
           <w:rStyle w:val="FootnoteReference"/>
         </w:rPr>
-        <w:footnoteReference w:id="133"/>
+        <w:footnoteReference w:id="134"/>
       </w:r>
       <w:r>
         <w:rPr>
@@ -3450,7 +3465,7 @@
         <w:rPr>
           <w:rStyle w:val="FootnoteReference"/>
         </w:rPr>
-        <w:footnoteReference w:id="134"/>
+        <w:footnoteReference w:id="135"/>
       </w:r>
       <w:r>
         <w:rPr>
@@ -3518,7 +3533,7 @@
         <w:rPr>
           <w:rStyle w:val="FootnoteReference"/>
         </w:rPr>
-        <w:footnoteReference w:id="135"/>
+        <w:footnoteReference w:id="136"/>
       </w:r>
       <w:r>
         <w:rPr>
@@ -3533,7 +3548,7 @@
         <w:rPr>
           <w:rStyle w:val="FootnoteReference"/>
         </w:rPr>
-        <w:footnoteReference w:id="136"/>
+        <w:footnoteReference w:id="137"/>
       </w:r>
       <w:r>
         <w:rPr>
@@ -3565,7 +3580,7 @@
         <w:rPr>
           <w:rStyle w:val="FootnoteReference"/>
         </w:rPr>
-        <w:footnoteReference w:id="137"/>
+        <w:footnoteReference w:id="138"/>
       </w:r>
       <w:r>
         <w:rPr>
@@ -3580,7 +3595,7 @@
         <w:rPr>
           <w:rStyle w:val="FootnoteReference"/>
         </w:rPr>
-        <w:footnoteReference w:id="138"/>
+        <w:footnoteReference w:id="139"/>
       </w:r>
       <w:r>
         <w:rPr>
@@ -3595,7 +3610,7 @@
         <w:rPr>
           <w:rStyle w:val="FootnoteReference"/>
         </w:rPr>
-        <w:footnoteReference w:id="139"/>
+        <w:footnoteReference w:id="140"/>
       </w:r>
       <w:r>
         <w:rPr>
@@ -3610,7 +3625,7 @@
         <w:rPr>
           <w:rStyle w:val="FootnoteReference"/>
         </w:rPr>
-        <w:footnoteReference w:id="140"/>
+        <w:footnoteReference w:id="141"/>
       </w:r>
       <w:r>
         <w:rPr>
@@ -3661,7 +3676,7 @@
         <w:rPr>
           <w:rStyle w:val="FootnoteReference"/>
         </w:rPr>
-        <w:footnoteReference w:id="141"/>
+        <w:footnoteReference w:id="142"/>
       </w:r>
       <w:r>
         <w:rPr>
@@ -3676,7 +3691,7 @@
         <w:rPr>
           <w:rStyle w:val="FootnoteReference"/>
         </w:rPr>
-        <w:footnoteReference w:id="142"/>
+        <w:footnoteReference w:id="143"/>
       </w:r>
       <w:r>
         <w:rPr>
@@ -3708,7 +3723,7 @@
         <w:rPr>
           <w:rStyle w:val="FootnoteReference"/>
         </w:rPr>
-        <w:footnoteReference w:id="143"/>
+        <w:footnoteReference w:id="144"/>
       </w:r>
       <w:r>
         <w:rPr>
@@ -3723,7 +3738,7 @@
         <w:rPr>
           <w:rStyle w:val="FootnoteReference"/>
         </w:rPr>
-        <w:footnoteReference w:id="144"/>
+        <w:footnoteReference w:id="145"/>
       </w:r>
       <w:r>
         <w:rPr>
@@ -3793,7 +3808,7 @@
         <w:rPr>
           <w:rStyle w:val="FootnoteReference"/>
         </w:rPr>
-        <w:footnoteReference w:id="145"/>
+        <w:footnoteReference w:id="146"/>
       </w:r>
       <w:r>
         <w:rPr>
@@ -3808,7 +3823,7 @@
         <w:rPr>
           <w:rStyle w:val="FootnoteReference"/>
         </w:rPr>
-        <w:footnoteReference w:id="146"/>
+        <w:footnoteReference w:id="147"/>
       </w:r>
     </w:p>
     <w:p>
@@ -3850,7 +3865,7 @@
         <w:rPr>
           <w:rStyle w:val="FootnoteReference"/>
         </w:rPr>
-        <w:footnoteReference w:id="147"/>
+        <w:footnoteReference w:id="148"/>
       </w:r>
       <w:r>
         <w:rPr>
@@ -3885,7 +3900,7 @@
         <w:rPr>
           <w:rStyle w:val="FootnoteReference"/>
         </w:rPr>
-        <w:footnoteReference w:id="148"/>
+        <w:footnoteReference w:id="149"/>
       </w:r>
       <w:r>
         <w:rPr>
@@ -3920,7 +3935,7 @@
         <w:rPr>
           <w:rStyle w:val="FootnoteReference"/>
         </w:rPr>
-        <w:footnoteReference w:id="149"/>
+        <w:footnoteReference w:id="150"/>
       </w:r>
       <w:r>
         <w:rPr>
@@ -3935,7 +3950,7 @@
         <w:rPr>
           <w:rStyle w:val="FootnoteReference"/>
         </w:rPr>
-        <w:footnoteReference w:id="150"/>
+        <w:footnoteReference w:id="151"/>
       </w:r>
       <w:r>
         <w:rPr>
@@ -3970,7 +3985,7 @@
         <w:rPr>
           <w:rStyle w:val="FootnoteReference"/>
         </w:rPr>
-        <w:footnoteReference w:id="151"/>
+        <w:footnoteReference w:id="152"/>
       </w:r>
       <w:r>
         <w:rPr>
@@ -4005,7 +4020,7 @@
         <w:rPr>
           <w:rStyle w:val="FootnoteReference"/>
         </w:rPr>
-        <w:footnoteReference w:id="152"/>
+        <w:footnoteReference w:id="153"/>
       </w:r>
       <w:r>
         <w:rPr>
@@ -4040,7 +4055,7 @@
         <w:rPr>
           <w:rStyle w:val="FootnoteReference"/>
         </w:rPr>
-        <w:footnoteReference w:id="153"/>
+        <w:footnoteReference w:id="154"/>
       </w:r>
       <w:r>
         <w:rPr>
@@ -4055,7 +4070,7 @@
         <w:rPr>
           <w:rStyle w:val="FootnoteReference"/>
         </w:rPr>
-        <w:footnoteReference w:id="154"/>
+        <w:footnoteReference w:id="155"/>
       </w:r>
     </w:p>
     <w:p>
@@ -4078,7 +4093,7 @@
         <w:rPr>
           <w:rStyle w:val="FootnoteReference"/>
         </w:rPr>
-        <w:footnoteReference w:id="155"/>
+        <w:footnoteReference w:id="156"/>
       </w:r>
       <w:r>
         <w:rPr>
@@ -4093,7 +4108,7 @@
         <w:rPr>
           <w:rStyle w:val="FootnoteReference"/>
         </w:rPr>
-        <w:footnoteReference w:id="156"/>
+        <w:footnoteReference w:id="157"/>
       </w:r>
       <w:r>
         <w:rPr>
@@ -4108,7 +4123,7 @@
         <w:rPr>
           <w:rStyle w:val="FootnoteReference"/>
         </w:rPr>
-        <w:footnoteReference w:id="157"/>
+        <w:footnoteReference w:id="158"/>
       </w:r>
       <w:r>
         <w:rPr>
@@ -4123,7 +4138,7 @@
         <w:rPr>
           <w:rStyle w:val="FootnoteReference"/>
         </w:rPr>
-        <w:footnoteReference w:id="158"/>
+        <w:footnoteReference w:id="159"/>
       </w:r>
       <w:r>
         <w:rPr>
@@ -4158,7 +4173,7 @@
         <w:rPr>
           <w:rStyle w:val="FootnoteReference"/>
         </w:rPr>
-        <w:footnoteReference w:id="159"/>
+        <w:footnoteReference w:id="160"/>
       </w:r>
       <w:r>
         <w:rPr>
@@ -4193,7 +4208,7 @@
         <w:rPr>
           <w:rStyle w:val="FootnoteReference"/>
         </w:rPr>
-        <w:footnoteReference w:id="160"/>
+        <w:footnoteReference w:id="161"/>
       </w:r>
       <w:r>
         <w:rPr>
@@ -4248,7 +4263,7 @@
         <w:rPr>
           <w:rStyle w:val="FootnoteReference"/>
         </w:rPr>
-        <w:footnoteReference w:id="161"/>
+        <w:footnoteReference w:id="162"/>
       </w:r>
       <w:r>
         <w:rPr>
@@ -4263,7 +4278,7 @@
         <w:rPr>
           <w:rStyle w:val="FootnoteReference"/>
         </w:rPr>
-        <w:footnoteReference w:id="162"/>
+        <w:footnoteReference w:id="163"/>
       </w:r>
       <w:r>
         <w:rPr>
@@ -4296,7 +4311,7 @@
         <w:rPr>
           <w:rStyle w:val="FootnoteReference"/>
         </w:rPr>
-        <w:footnoteReference w:id="163"/>
+        <w:footnoteReference w:id="164"/>
       </w:r>
       <w:r>
         <w:rPr>
@@ -4347,7 +4362,7 @@
         <w:rPr>
           <w:rStyle w:val="FootnoteReference"/>
         </w:rPr>
-        <w:footnoteReference w:id="164"/>
+        <w:footnoteReference w:id="165"/>
       </w:r>
       <w:r>
         <w:rPr>
@@ -4362,7 +4377,7 @@
         <w:rPr>
           <w:rStyle w:val="FootnoteReference"/>
         </w:rPr>
-        <w:footnoteReference w:id="165"/>
+        <w:footnoteReference w:id="166"/>
       </w:r>
       <w:r>
         <w:rPr>
@@ -4395,7 +4410,7 @@
         <w:rPr>
           <w:rStyle w:val="FootnoteReference"/>
         </w:rPr>
-        <w:footnoteReference w:id="166"/>
+        <w:footnoteReference w:id="167"/>
       </w:r>
       <w:r>
         <w:rPr>
@@ -4410,7 +4425,7 @@
         <w:rPr>
           <w:rStyle w:val="FootnoteReference"/>
         </w:rPr>
-        <w:footnoteReference w:id="167"/>
+        <w:footnoteReference w:id="168"/>
       </w:r>
       <w:r>
         <w:rPr>
@@ -4425,7 +4440,7 @@
         <w:rPr>
           <w:rStyle w:val="FootnoteReference"/>
         </w:rPr>
-        <w:footnoteReference w:id="168"/>
+        <w:footnoteReference w:id="169"/>
       </w:r>
       <w:r>
         <w:rPr>
@@ -4440,7 +4455,7 @@
         <w:rPr>
           <w:rStyle w:val="FootnoteReference"/>
         </w:rPr>
-        <w:footnoteReference w:id="169"/>
+        <w:footnoteReference w:id="170"/>
       </w:r>
     </w:p>
     <w:p>
@@ -4463,7 +4478,7 @@
         <w:rPr>
           <w:rStyle w:val="FootnoteReference"/>
         </w:rPr>
-        <w:footnoteReference w:id="170"/>
+        <w:footnoteReference w:id="171"/>
       </w:r>
       <w:r>
         <w:rPr>
@@ -4478,7 +4493,7 @@
         <w:rPr>
           <w:rStyle w:val="FootnoteReference"/>
         </w:rPr>
-        <w:footnoteReference w:id="171"/>
+        <w:footnoteReference w:id="172"/>
       </w:r>
       <w:r>
         <w:rPr>
@@ -4513,7 +4528,7 @@
         <w:rPr>
           <w:rStyle w:val="FootnoteReference"/>
         </w:rPr>
-        <w:footnoteReference w:id="172"/>
+        <w:footnoteReference w:id="173"/>
       </w:r>
       <w:r>
         <w:rPr>
@@ -4528,7 +4543,7 @@
         <w:rPr>
           <w:rStyle w:val="FootnoteReference"/>
         </w:rPr>
-        <w:footnoteReference w:id="173"/>
+        <w:footnoteReference w:id="174"/>
       </w:r>
     </w:p>
     <w:p>
@@ -4551,7 +4566,7 @@
         <w:rPr>
           <w:rStyle w:val="FootnoteReference"/>
         </w:rPr>
-        <w:footnoteReference w:id="174"/>
+        <w:footnoteReference w:id="175"/>
       </w:r>
       <w:r>
         <w:rPr>
@@ -4566,7 +4581,7 @@
         <w:rPr>
           <w:rStyle w:val="FootnoteReference"/>
         </w:rPr>
-        <w:footnoteReference w:id="175"/>
+        <w:footnoteReference w:id="176"/>
       </w:r>
       <w:r>
         <w:rPr>
@@ -4581,7 +4596,7 @@
         <w:rPr>
           <w:rStyle w:val="FootnoteReference"/>
         </w:rPr>
-        <w:footnoteReference w:id="176"/>
+        <w:footnoteReference w:id="177"/>
       </w:r>
       <w:r>
         <w:rPr>
@@ -4616,7 +4631,7 @@
         <w:rPr>
           <w:rStyle w:val="FootnoteReference"/>
         </w:rPr>
-        <w:footnoteReference w:id="177"/>
+        <w:footnoteReference w:id="178"/>
       </w:r>
       <w:r>
         <w:rPr>
@@ -4631,7 +4646,7 @@
         <w:rPr>
           <w:rStyle w:val="FootnoteReference"/>
         </w:rPr>
-        <w:footnoteReference w:id="178"/>
+        <w:footnoteReference w:id="179"/>
       </w:r>
       <w:r>
         <w:rPr>
@@ -4666,7 +4681,7 @@
         <w:rPr>
           <w:rStyle w:val="FootnoteReference"/>
         </w:rPr>
-        <w:footnoteReference w:id="179"/>
+        <w:footnoteReference w:id="180"/>
       </w:r>
       <w:r>
         <w:rPr>
@@ -4701,7 +4716,7 @@
         <w:rPr>
           <w:rStyle w:val="FootnoteReference"/>
         </w:rPr>
-        <w:footnoteReference w:id="180"/>
+        <w:footnoteReference w:id="181"/>
       </w:r>
       <w:r>
         <w:rPr>
@@ -4736,7 +4751,7 @@
         <w:rPr>
           <w:rStyle w:val="FootnoteReference"/>
         </w:rPr>
-        <w:footnoteReference w:id="181"/>
+        <w:footnoteReference w:id="182"/>
       </w:r>
       <w:r>
         <w:rPr>
@@ -4771,7 +4786,7 @@
         <w:rPr>
           <w:rStyle w:val="FootnoteReference"/>
         </w:rPr>
-        <w:footnoteReference w:id="182"/>
+        <w:footnoteReference w:id="183"/>
       </w:r>
     </w:p>
     <w:p>
@@ -4833,7 +4848,7 @@
         <w:rPr>
           <w:rStyle w:val="FootnoteReference"/>
         </w:rPr>
-        <w:footnoteReference w:id="183"/>
+        <w:footnoteReference w:id="184"/>
       </w:r>
       <w:r>
         <w:rPr>
@@ -4848,7 +4863,7 @@
         <w:rPr>
           <w:rStyle w:val="FootnoteReference"/>
         </w:rPr>
-        <w:footnoteReference w:id="184"/>
+        <w:footnoteReference w:id="185"/>
       </w:r>
       <w:r>
         <w:rPr>
@@ -4863,7 +4878,7 @@
         <w:rPr>
           <w:rStyle w:val="FootnoteReference"/>
         </w:rPr>
-        <w:footnoteReference w:id="185"/>
+        <w:footnoteReference w:id="186"/>
       </w:r>
       <w:r>
         <w:rPr>
@@ -4895,7 +4910,7 @@
         <w:rPr>
           <w:rStyle w:val="FootnoteReference"/>
         </w:rPr>
-        <w:footnoteReference w:id="186"/>
+        <w:footnoteReference w:id="187"/>
       </w:r>
       <w:r>
         <w:rPr>
@@ -4910,7 +4925,7 @@
         <w:rPr>
           <w:rStyle w:val="FootnoteReference"/>
         </w:rPr>
-        <w:footnoteReference w:id="187"/>
+        <w:footnoteReference w:id="188"/>
       </w:r>
       <w:r>
         <w:rPr>
@@ -4925,7 +4940,7 @@
         <w:rPr>
           <w:rStyle w:val="FootnoteReference"/>
         </w:rPr>
-        <w:footnoteReference w:id="188"/>
+        <w:footnoteReference w:id="189"/>
       </w:r>
       <w:r>
         <w:rPr>
@@ -4960,7 +4975,7 @@
         <w:rPr>
           <w:rStyle w:val="FootnoteReference"/>
         </w:rPr>
-        <w:footnoteReference w:id="189"/>
+        <w:footnoteReference w:id="190"/>
       </w:r>
       <w:r>
         <w:rPr>
@@ -4975,7 +4990,7 @@
         <w:rPr>
           <w:rStyle w:val="FootnoteReference"/>
         </w:rPr>
-        <w:footnoteReference w:id="190"/>
+        <w:footnoteReference w:id="191"/>
       </w:r>
       <w:r>
         <w:rPr>
@@ -4990,7 +5005,7 @@
         <w:rPr>
           <w:rStyle w:val="FootnoteReference"/>
         </w:rPr>
-        <w:footnoteReference w:id="191"/>
+        <w:footnoteReference w:id="192"/>
       </w:r>
       <w:r>
         <w:rPr>
@@ -5005,7 +5020,7 @@
         <w:rPr>
           <w:rStyle w:val="FootnoteReference"/>
         </w:rPr>
-        <w:footnoteReference w:id="192"/>
+        <w:footnoteReference w:id="193"/>
       </w:r>
       <w:r>
         <w:rPr>
@@ -5040,7 +5055,7 @@
         <w:rPr>
           <w:rStyle w:val="FootnoteReference"/>
         </w:rPr>
-        <w:footnoteReference w:id="193"/>
+        <w:footnoteReference w:id="194"/>
       </w:r>
       <w:r>
         <w:rPr>
@@ -5075,7 +5090,7 @@
         <w:rPr>
           <w:rStyle w:val="FootnoteReference"/>
         </w:rPr>
-        <w:footnoteReference w:id="194"/>
+        <w:footnoteReference w:id="195"/>
       </w:r>
       <w:r>
         <w:rPr>
@@ -5090,7 +5105,7 @@
         <w:rPr>
           <w:rStyle w:val="FootnoteReference"/>
         </w:rPr>
-        <w:footnoteReference w:id="195"/>
+        <w:footnoteReference w:id="196"/>
       </w:r>
       <w:r>
         <w:rPr>
@@ -5105,7 +5120,7 @@
         <w:rPr>
           <w:rStyle w:val="FootnoteReference"/>
         </w:rPr>
-        <w:footnoteReference w:id="196"/>
+        <w:footnoteReference w:id="197"/>
       </w:r>
       <w:r>
         <w:rPr>
@@ -5192,7 +5207,7 @@
         <w:rPr>
           <w:rStyle w:val="FootnoteReference"/>
         </w:rPr>
-        <w:footnoteReference w:id="197"/>
+        <w:footnoteReference w:id="198"/>
       </w:r>
       <w:r>
         <w:rPr>
@@ -5207,7 +5222,7 @@
         <w:rPr>
           <w:rStyle w:val="FootnoteReference"/>
         </w:rPr>
-        <w:footnoteReference w:id="198"/>
+        <w:footnoteReference w:id="199"/>
       </w:r>
       <w:r>
         <w:rPr>
@@ -5222,7 +5237,7 @@
         <w:rPr>
           <w:rStyle w:val="FootnoteReference"/>
         </w:rPr>
-        <w:footnoteReference w:id="199"/>
+        <w:footnoteReference w:id="200"/>
       </w:r>
       <w:r>
         <w:rPr>
@@ -5237,7 +5252,7 @@
         <w:rPr>
           <w:rStyle w:val="FootnoteReference"/>
         </w:rPr>
-        <w:footnoteReference w:id="200"/>
+        <w:footnoteReference w:id="201"/>
       </w:r>
       <w:r>
         <w:rPr>
@@ -5269,7 +5284,7 @@
         <w:rPr>
           <w:rStyle w:val="FootnoteReference"/>
         </w:rPr>
-        <w:footnoteReference w:id="201"/>
+        <w:footnoteReference w:id="202"/>
       </w:r>
       <w:r>
         <w:rPr>
@@ -5284,7 +5299,7 @@
         <w:rPr>
           <w:rStyle w:val="FootnoteReference"/>
         </w:rPr>
-        <w:footnoteReference w:id="202"/>
+        <w:footnoteReference w:id="203"/>
       </w:r>
       <w:r>
         <w:rPr>
@@ -5316,7 +5331,7 @@
         <w:rPr>
           <w:rStyle w:val="FootnoteReference"/>
         </w:rPr>
-        <w:footnoteReference w:id="203"/>
+        <w:footnoteReference w:id="204"/>
       </w:r>
       <w:r>
         <w:rPr>
@@ -5331,7 +5346,7 @@
         <w:rPr>
           <w:rStyle w:val="FootnoteReference"/>
         </w:rPr>
-        <w:footnoteReference w:id="204"/>
+        <w:footnoteReference w:id="205"/>
       </w:r>
     </w:p>
     <w:p>
@@ -5373,7 +5388,7 @@
         <w:rPr>
           <w:rStyle w:val="FootnoteReference"/>
         </w:rPr>
-        <w:footnoteReference w:id="205"/>
+        <w:footnoteReference w:id="206"/>
       </w:r>
       <w:r>
         <w:rPr>
@@ -5388,7 +5403,7 @@
         <w:rPr>
           <w:rStyle w:val="FootnoteReference"/>
         </w:rPr>
-        <w:footnoteReference w:id="206"/>
+        <w:footnoteReference w:id="207"/>
       </w:r>
       <w:r>
         <w:rPr>
@@ -5403,7 +5418,7 @@
         <w:rPr>
           <w:rStyle w:val="FootnoteReference"/>
         </w:rPr>
-        <w:footnoteReference w:id="207"/>
+        <w:footnoteReference w:id="208"/>
       </w:r>
       <w:r>
         <w:rPr>
@@ -5418,7 +5433,7 @@
         <w:rPr>
           <w:rStyle w:val="FootnoteReference"/>
         </w:rPr>
-        <w:footnoteReference w:id="208"/>
+        <w:footnoteReference w:id="209"/>
       </w:r>
       <w:r>
         <w:rPr>
@@ -5433,7 +5448,7 @@
         <w:rPr>
           <w:rStyle w:val="FootnoteReference"/>
         </w:rPr>
-        <w:footnoteReference w:id="209"/>
+        <w:footnoteReference w:id="210"/>
       </w:r>
       <w:r>
         <w:rPr>
@@ -5448,7 +5463,7 @@
         <w:rPr>
           <w:rStyle w:val="FootnoteReference"/>
         </w:rPr>
-        <w:footnoteReference w:id="210"/>
+        <w:footnoteReference w:id="211"/>
       </w:r>
       <w:r>
         <w:rPr>
@@ -5480,7 +5495,7 @@
         <w:rPr>
           <w:rStyle w:val="FootnoteReference"/>
         </w:rPr>
-        <w:footnoteReference w:id="211"/>
+        <w:footnoteReference w:id="212"/>
       </w:r>
       <w:r>
         <w:rPr>
@@ -5495,7 +5510,7 @@
         <w:rPr>
           <w:rStyle w:val="FootnoteReference"/>
         </w:rPr>
-        <w:footnoteReference w:id="212"/>
+        <w:footnoteReference w:id="213"/>
       </w:r>
       <w:r>
         <w:rPr>
@@ -5510,7 +5525,22 @@
         <w:rPr>
           <w:rStyle w:val="FootnoteReference"/>
         </w:rPr>
-        <w:footnoteReference w:id="213"/>
+        <w:footnoteReference w:id="214"/>
+      </w:r>
+      <w:r>
+        <w:rPr>
+          <w:rFonts w:ascii="David" w:cs="David" w:eastAsia="David" w:hAnsi="David"/>
+          <w:sz w:val="24"/>
+          <w:szCs w:val="24"/>
+          <w:rtl/>
+        </w:rPr>
+        <w:t xml:space="preserve"> פדן מציין שעל אף התפיסה הכוללת של אמו"ן, לא נבנתה בפרקליטות תוכנית מקבילה, ושיתופי הפעולה בין הגופים נמשכו רק בהקשרים של תיקים ופרשות מסוימים.</w:t>
+      </w:r>
+      <w:r>
+        <w:rPr>
+          <w:rStyle w:val="FootnoteReference"/>
+        </w:rPr>
+        <w:footnoteReference w:id="215"/>
       </w:r>
       <w:r>
         <w:rPr>
@@ -5542,7 +5572,7 @@
         <w:rPr>
           <w:rStyle w:val="FootnoteReference"/>
         </w:rPr>
-        <w:footnoteReference w:id="214"/>
+        <w:footnoteReference w:id="216"/>
       </w:r>
       <w:r>
         <w:rPr>
@@ -5593,7 +5623,7 @@
         <w:rPr>
           <w:rStyle w:val="FootnoteReference"/>
         </w:rPr>
-        <w:footnoteReference w:id="215"/>
+        <w:footnoteReference w:id="217"/>
       </w:r>
       <w:r>
         <w:rPr>
@@ -5608,7 +5638,7 @@
         <w:rPr>
           <w:rStyle w:val="FootnoteReference"/>
         </w:rPr>
-        <w:footnoteReference w:id="216"/>
+        <w:footnoteReference w:id="218"/>
       </w:r>
       <w:r>
         <w:rPr>
@@ -5623,7 +5653,7 @@
         <w:rPr>
           <w:rStyle w:val="FootnoteReference"/>
         </w:rPr>
-        <w:footnoteReference w:id="217"/>
+        <w:footnoteReference w:id="219"/>
       </w:r>
       <w:r>
         <w:rPr>
@@ -5655,7 +5685,7 @@
         <w:rPr>
           <w:rStyle w:val="FootnoteReference"/>
         </w:rPr>
-        <w:footnoteReference w:id="218"/>
+        <w:footnoteReference w:id="220"/>
       </w:r>
       <w:r>
         <w:rPr>
@@ -5670,7 +5700,7 @@
         <w:rPr>
           <w:rStyle w:val="FootnoteReference"/>
         </w:rPr>
-        <w:footnoteReference w:id="219"/>
+        <w:footnoteReference w:id="221"/>
       </w:r>
       <w:r>
         <w:rPr>
@@ -5685,7 +5715,7 @@
         <w:rPr>
           <w:rStyle w:val="FootnoteReference"/>
         </w:rPr>
-        <w:footnoteReference w:id="220"/>
+        <w:footnoteReference w:id="222"/>
       </w:r>
       <w:r>
         <w:rPr>
@@ -5700,7 +5730,7 @@
         <w:rPr>
           <w:rStyle w:val="FootnoteReference"/>
         </w:rPr>
-        <w:footnoteReference w:id="221"/>
+        <w:footnoteReference w:id="223"/>
       </w:r>
       <w:r>
         <w:rPr>
@@ -5715,7 +5745,7 @@
         <w:rPr>
           <w:rStyle w:val="FootnoteReference"/>
         </w:rPr>
-        <w:footnoteReference w:id="222"/>
+        <w:footnoteReference w:id="224"/>
       </w:r>
       <w:r>
         <w:rPr>
@@ -5783,7 +5813,7 @@
         <w:rPr>
           <w:rStyle w:val="FootnoteReference"/>
         </w:rPr>
-        <w:footnoteReference w:id="223"/>
+        <w:footnoteReference w:id="225"/>
       </w:r>
       <w:r>
         <w:rPr>
@@ -5798,7 +5828,7 @@
         <w:rPr>
           <w:rStyle w:val="FootnoteReference"/>
         </w:rPr>
-        <w:footnoteReference w:id="224"/>
+        <w:footnoteReference w:id="226"/>
       </w:r>
     </w:p>
     <w:p>
@@ -5841,7 +5871,7 @@
         <w:rPr>
           <w:rStyle w:val="FootnoteReference"/>
         </w:rPr>
-        <w:footnoteReference w:id="225"/>
+        <w:footnoteReference w:id="227"/>
       </w:r>
       <w:r>
         <w:rPr>
@@ -5873,7 +5903,7 @@
         <w:rPr>
           <w:rStyle w:val="FootnoteReference"/>
         </w:rPr>
-        <w:footnoteReference w:id="226"/>
+        <w:footnoteReference w:id="228"/>
       </w:r>
       <w:r>
         <w:rPr>
@@ -5888,7 +5918,7 @@
         <w:rPr>
           <w:rStyle w:val="FootnoteReference"/>
         </w:rPr>
-        <w:footnoteReference w:id="227"/>
+        <w:footnoteReference w:id="229"/>
       </w:r>
       <w:r>
         <w:rPr>
@@ -5903,7 +5933,7 @@
         <w:rPr>
           <w:rStyle w:val="FootnoteReference"/>
         </w:rPr>
-        <w:footnoteReference w:id="228"/>
+        <w:footnoteReference w:id="230"/>
       </w:r>
       <w:r>
         <w:rPr>
@@ -5918,7 +5948,7 @@
         <w:rPr>
           <w:rStyle w:val="FootnoteReference"/>
         </w:rPr>
-        <w:footnoteReference w:id="229"/>
+        <w:footnoteReference w:id="231"/>
       </w:r>
       <w:r>
         <w:rPr>
@@ -5953,7 +5983,7 @@
         <w:rPr>
           <w:rStyle w:val="FootnoteReference"/>
         </w:rPr>
-        <w:footnoteReference w:id="230"/>
+        <w:footnoteReference w:id="232"/>
       </w:r>
       <w:r>
         <w:rPr>
@@ -5968,7 +5998,7 @@
         <w:rPr>
           <w:rStyle w:val="FootnoteReference"/>
         </w:rPr>
-        <w:footnoteReference w:id="231"/>
+        <w:footnoteReference w:id="233"/>
       </w:r>
       <w:r>
         <w:rPr>
@@ -5983,7 +6013,7 @@
         <w:rPr>
           <w:rStyle w:val="FootnoteReference"/>
         </w:rPr>
-        <w:footnoteReference w:id="232"/>
+        <w:footnoteReference w:id="234"/>
       </w:r>
       <w:r>
         <w:rPr>
@@ -5998,7 +6028,7 @@
         <w:rPr>
           <w:rStyle w:val="FootnoteReference"/>
         </w:rPr>
-        <w:footnoteReference w:id="233"/>
+        <w:footnoteReference w:id="235"/>
       </w:r>
       <w:r>
         <w:rPr>
@@ -6031,7 +6061,7 @@
         <w:rPr>
           <w:rStyle w:val="FootnoteReference"/>
         </w:rPr>
-        <w:footnoteReference w:id="234"/>
+        <w:footnoteReference w:id="236"/>
       </w:r>
       <w:r>
         <w:rPr>
@@ -6046,7 +6076,7 @@
         <w:rPr>
           <w:rStyle w:val="FootnoteReference"/>
         </w:rPr>
-        <w:footnoteReference w:id="235"/>
+        <w:footnoteReference w:id="237"/>
       </w:r>
       <w:r>
         <w:rPr>
@@ -6061,7 +6091,7 @@
         <w:rPr>
           <w:rStyle w:val="FootnoteReference"/>
         </w:rPr>
-        <w:footnoteReference w:id="236"/>
+        <w:footnoteReference w:id="238"/>
       </w:r>
       <w:r>
         <w:rPr>
@@ -6076,7 +6106,7 @@
         <w:rPr>
           <w:rStyle w:val="FootnoteReference"/>
         </w:rPr>
-        <w:footnoteReference w:id="237"/>
+        <w:footnoteReference w:id="239"/>
       </w:r>
     </w:p>
     <w:p>
@@ -6099,7 +6129,7 @@
         <w:rPr>
           <w:rStyle w:val="FootnoteReference"/>
         </w:rPr>
-        <w:footnoteReference w:id="238"/>
+        <w:footnoteReference w:id="240"/>
       </w:r>
       <w:r>
         <w:rPr>
@@ -6114,7 +6144,7 @@
         <w:rPr>
           <w:rStyle w:val="FootnoteReference"/>
         </w:rPr>
-        <w:footnoteReference w:id="239"/>
+        <w:footnoteReference w:id="241"/>
       </w:r>
       <w:r>
         <w:rPr>
@@ -9311,7 +9341,7 @@
           <w:szCs w:val="20"/>
           <w:rtl/>
         </w:rPr>
-        <w:t xml:space="preserve"> יג 411 (2022).</w:t>
+        <w:t xml:space="preserve"> יג 411, 430 (2022).</w:t>
       </w:r>
     </w:p>
   </w:footnote>
@@ -11226,26 +11256,7 @@
           <w:szCs w:val="20"/>
           <w:rtl/>
         </w:rPr>
-        <w:t xml:space="preserve"> יד </w:t>
-      </w:r>
-      <w:r>
-        <w:rPr>
-          <w:rFonts w:ascii="David" w:cs="David" w:eastAsia="David" w:hAnsi="David"/>
-          <w:sz w:val="20"/>
-          <w:szCs w:val="20"/>
-          <w:shd w:fill="FFF200" w:color="auto" w:val="clear"/>
-          <w:rtl/>
-        </w:rPr>
-        <w:t xml:space="preserve">[עמוד]</w:t>
-      </w:r>
-      <w:r>
-        <w:rPr>
-          <w:rFonts w:ascii="David" w:cs="David" w:eastAsia="David" w:hAnsi="David"/>
-          <w:sz w:val="20"/>
-          <w:szCs w:val="20"/>
-          <w:rtl w:val="false"/>
-        </w:rPr>
-        <w:t xml:space="preserve"> (2023).</w:t>
+        <w:t xml:space="preserve"> יד 195, 206, 220 (2023).</w:t>
       </w:r>
     </w:p>
   </w:footnote>
@@ -11313,6 +11324,30 @@
           <w:szCs w:val="20"/>
           <w:rtl/>
         </w:rPr>
+        <w:t xml:space="preserve"> פודם, דרעי וטולדנו, לעיל ה"ש 116, בעמ' 209.</w:t>
+      </w:r>
+    </w:p>
+  </w:footnote>
+  <w:footnote w:id="119">
+    <w:p>
+      <w:pPr>
+        <w:bidi/>
+        <w:spacing w:after="40" w:line="240"/>
+        <w:jc w:val="both"/>
+      </w:pPr>
+      <w:r>
+        <w:rPr>
+          <w:rStyle w:val="FootnoteReference"/>
+        </w:rPr>
+        <w:footnoteRef/>
+      </w:r>
+      <w:r>
+        <w:rPr>
+          <w:rFonts w:ascii="David" w:cs="David" w:eastAsia="David" w:hAnsi="David"/>
+          <w:sz w:val="20"/>
+          <w:szCs w:val="20"/>
+          <w:rtl/>
+        </w:rPr>
         <w:t xml:space="preserve"> דפנה ברק-ארז </w:t>
       </w:r>
       <w:r>
@@ -11357,31 +11392,31 @@
       </w:r>
     </w:p>
   </w:footnote>
-  <w:footnote w:id="119">
-    <w:p>
-      <w:pPr>
-        <w:bidi/>
-        <w:spacing w:after="40" w:line="240"/>
-        <w:jc w:val="both"/>
-      </w:pPr>
-      <w:r>
-        <w:rPr>
-          <w:rStyle w:val="FootnoteReference"/>
-        </w:rPr>
-        <w:footnoteRef/>
-      </w:r>
-      <w:r>
-        <w:rPr>
-          <w:rFonts w:ascii="David" w:cs="David" w:eastAsia="David" w:hAnsi="David"/>
-          <w:sz w:val="20"/>
-          <w:szCs w:val="20"/>
-          <w:rtl/>
-        </w:rPr>
-        <w:t xml:space="preserve"> ברק-ארז, לעיל ה"ש 118, בעמ' 574.</w:t>
-      </w:r>
-    </w:p>
-  </w:footnote>
   <w:footnote w:id="120">
+    <w:p>
+      <w:pPr>
+        <w:bidi/>
+        <w:spacing w:after="40" w:line="240"/>
+        <w:jc w:val="both"/>
+      </w:pPr>
+      <w:r>
+        <w:rPr>
+          <w:rStyle w:val="FootnoteReference"/>
+        </w:rPr>
+        <w:footnoteRef/>
+      </w:r>
+      <w:r>
+        <w:rPr>
+          <w:rFonts w:ascii="David" w:cs="David" w:eastAsia="David" w:hAnsi="David"/>
+          <w:sz w:val="20"/>
+          <w:szCs w:val="20"/>
+          <w:rtl/>
+        </w:rPr>
+        <w:t xml:space="preserve"> ברק-ארז, לעיל ה"ש 119, בעמ' 574.</w:t>
+      </w:r>
+    </w:p>
+  </w:footnote>
+  <w:footnote w:id="121">
     <w:p>
       <w:pPr>
         <w:bidi/>
@@ -11463,7 +11498,7 @@
       </w:r>
     </w:p>
   </w:footnote>
-  <w:footnote w:id="121">
+  <w:footnote w:id="122">
     <w:p>
       <w:pPr>
         <w:bidi/>
@@ -11487,7 +11522,7 @@
       </w:r>
     </w:p>
   </w:footnote>
-  <w:footnote w:id="122">
+  <w:footnote w:id="123">
     <w:p>
       <w:pPr>
         <w:bidi/>
@@ -11511,7 +11546,7 @@
       </w:r>
     </w:p>
   </w:footnote>
-  <w:footnote w:id="123">
+  <w:footnote w:id="124">
     <w:p>
       <w:pPr>
         <w:bidi/>
@@ -11535,7 +11570,7 @@
       </w:r>
     </w:p>
   </w:footnote>
-  <w:footnote w:id="124">
+  <w:footnote w:id="125">
     <w:p>
       <w:pPr>
         <w:bidi/>
@@ -11579,7 +11614,7 @@
       </w:r>
     </w:p>
   </w:footnote>
-  <w:footnote w:id="125">
+  <w:footnote w:id="126">
     <w:p>
       <w:pPr>
         <w:bidi/>
@@ -11603,7 +11638,7 @@
       </w:r>
     </w:p>
   </w:footnote>
-  <w:footnote w:id="126">
+  <w:footnote w:id="127">
     <w:p>
       <w:pPr>
         <w:bidi/>
@@ -11627,7 +11662,7 @@
       </w:r>
     </w:p>
   </w:footnote>
-  <w:footnote w:id="127">
+  <w:footnote w:id="128">
     <w:p>
       <w:pPr>
         <w:bidi/>
@@ -11651,7 +11686,7 @@
       </w:r>
     </w:p>
   </w:footnote>
-  <w:footnote w:id="128">
+  <w:footnote w:id="129">
     <w:p>
       <w:pPr>
         <w:bidi/>
@@ -11675,7 +11710,7 @@
       </w:r>
     </w:p>
   </w:footnote>
-  <w:footnote w:id="129">
+  <w:footnote w:id="130">
     <w:p>
       <w:pPr>
         <w:bidi/>
@@ -11719,7 +11754,7 @@
       </w:r>
     </w:p>
   </w:footnote>
-  <w:footnote w:id="130">
+  <w:footnote w:id="131">
     <w:p>
       <w:pPr>
         <w:bidi/>
@@ -11743,7 +11778,7 @@
       </w:r>
     </w:p>
   </w:footnote>
-  <w:footnote w:id="131">
+  <w:footnote w:id="132">
     <w:p>
       <w:pPr>
         <w:bidi/>
@@ -11767,7 +11802,7 @@
       </w:r>
     </w:p>
   </w:footnote>
-  <w:footnote w:id="132">
+  <w:footnote w:id="133">
     <w:p>
       <w:pPr>
         <w:bidi/>
@@ -11791,7 +11826,7 @@
       </w:r>
     </w:p>
   </w:footnote>
-  <w:footnote w:id="133">
+  <w:footnote w:id="134">
     <w:p>
       <w:pPr>
         <w:bidi/>
@@ -11815,7 +11850,7 @@
       </w:r>
     </w:p>
   </w:footnote>
-  <w:footnote w:id="134">
+  <w:footnote w:id="135">
     <w:p>
       <w:pPr>
         <w:bidi/>
@@ -11839,7 +11874,7 @@
       </w:r>
     </w:p>
   </w:footnote>
-  <w:footnote w:id="135">
+  <w:footnote w:id="136">
     <w:p>
       <w:pPr>
         <w:bidi/>
@@ -11863,7 +11898,7 @@
       </w:r>
     </w:p>
   </w:footnote>
-  <w:footnote w:id="136">
+  <w:footnote w:id="137">
     <w:p>
       <w:pPr>
         <w:bidi/>
@@ -11887,7 +11922,7 @@
       </w:r>
     </w:p>
   </w:footnote>
-  <w:footnote w:id="137">
+  <w:footnote w:id="138">
     <w:p>
       <w:pPr>
         <w:bidi/>
@@ -11911,7 +11946,7 @@
       </w:r>
     </w:p>
   </w:footnote>
-  <w:footnote w:id="138">
+  <w:footnote w:id="139">
     <w:p>
       <w:pPr>
         <w:bidi/>
@@ -11955,7 +11990,7 @@
       </w:r>
     </w:p>
   </w:footnote>
-  <w:footnote w:id="139">
+  <w:footnote w:id="140">
     <w:p>
       <w:pPr>
         <w:bidi/>
@@ -11979,7 +12014,7 @@
       </w:r>
     </w:p>
   </w:footnote>
-  <w:footnote w:id="140">
+  <w:footnote w:id="141">
     <w:p>
       <w:pPr>
         <w:bidi/>
@@ -12003,7 +12038,7 @@
       </w:r>
     </w:p>
   </w:footnote>
-  <w:footnote w:id="141">
+  <w:footnote w:id="142">
     <w:p>
       <w:pPr>
         <w:bidi/>
@@ -12047,7 +12082,7 @@
       </w:r>
     </w:p>
   </w:footnote>
-  <w:footnote w:id="142">
+  <w:footnote w:id="143">
     <w:p>
       <w:pPr>
         <w:bidi/>
@@ -12071,30 +12106,6 @@
       </w:r>
     </w:p>
   </w:footnote>
-  <w:footnote w:id="143">
-    <w:p>
-      <w:pPr>
-        <w:bidi/>
-        <w:spacing w:after="40" w:line="240"/>
-        <w:jc w:val="both"/>
-      </w:pPr>
-      <w:r>
-        <w:rPr>
-          <w:rStyle w:val="FootnoteReference"/>
-        </w:rPr>
-        <w:footnoteRef/>
-      </w:r>
-      <w:r>
-        <w:rPr>
-          <w:rFonts w:ascii="David" w:cs="David" w:eastAsia="David" w:hAnsi="David"/>
-          <w:sz w:val="20"/>
-          <w:szCs w:val="20"/>
-          <w:rtl/>
-        </w:rPr>
-        <w:t xml:space="preserve"> חסייסי ואחרים "עבירות אלימות", לעיל ה"ש 129, בעמ' 279; וייסבורד ואחרים "סל עבירות פע"ר", לעיל ה"ש 124, בעמ' 167.</w:t>
-      </w:r>
-    </w:p>
-  </w:footnote>
   <w:footnote w:id="144">
     <w:p>
       <w:pPr>
@@ -12115,11 +12126,35 @@
           <w:szCs w:val="20"/>
           <w:rtl/>
         </w:rPr>
+        <w:t xml:space="preserve"> חסייסי ואחרים "עבירות אלימות", לעיל ה"ש 130, בעמ' 279; וייסבורד ואחרים "סל עבירות פע"ר", לעיל ה"ש 125, בעמ' 167.</w:t>
+      </w:r>
+    </w:p>
+  </w:footnote>
+  <w:footnote w:id="145">
+    <w:p>
+      <w:pPr>
+        <w:bidi/>
+        <w:spacing w:after="40" w:line="240"/>
+        <w:jc w:val="both"/>
+      </w:pPr>
+      <w:r>
+        <w:rPr>
+          <w:rStyle w:val="FootnoteReference"/>
+        </w:rPr>
+        <w:footnoteRef/>
+      </w:r>
+      <w:r>
+        <w:rPr>
+          <w:rFonts w:ascii="David" w:cs="David" w:eastAsia="David" w:hAnsi="David"/>
+          <w:sz w:val="20"/>
+          <w:szCs w:val="20"/>
+          <w:rtl/>
+        </w:rPr>
         <w:t xml:space="preserve"> ליטמנוביץ ואחרים, לעיל ה"ש 34, בעמ' 243.</w:t>
       </w:r>
     </w:p>
   </w:footnote>
-  <w:footnote w:id="145">
+  <w:footnote w:id="146">
     <w:p>
       <w:pPr>
         <w:bidi/>
@@ -12143,7 +12178,7 @@
       </w:r>
     </w:p>
   </w:footnote>
-  <w:footnote w:id="146">
+  <w:footnote w:id="147">
     <w:p>
       <w:pPr>
         <w:bidi/>
@@ -12167,7 +12202,7 @@
       </w:r>
     </w:p>
   </w:footnote>
-  <w:footnote w:id="147">
+  <w:footnote w:id="148">
     <w:p>
       <w:pPr>
         <w:bidi/>
@@ -12191,7 +12226,7 @@
       </w:r>
     </w:p>
   </w:footnote>
-  <w:footnote w:id="148">
+  <w:footnote w:id="149">
     <w:p>
       <w:pPr>
         <w:bidi/>
@@ -12235,7 +12270,7 @@
       </w:r>
     </w:p>
   </w:footnote>
-  <w:footnote w:id="149">
+  <w:footnote w:id="150">
     <w:p>
       <w:pPr>
         <w:bidi/>
@@ -12279,7 +12314,7 @@
       </w:r>
     </w:p>
   </w:footnote>
-  <w:footnote w:id="150">
+  <w:footnote w:id="151">
     <w:p>
       <w:pPr>
         <w:bidi/>
@@ -12323,7 +12358,7 @@
       </w:r>
     </w:p>
   </w:footnote>
-  <w:footnote w:id="151">
+  <w:footnote w:id="152">
     <w:p>
       <w:pPr>
         <w:bidi/>
@@ -12385,7 +12420,7 @@
       </w:r>
     </w:p>
   </w:footnote>
-  <w:footnote w:id="152">
+  <w:footnote w:id="153">
     <w:p>
       <w:pPr>
         <w:bidi/>
@@ -12429,7 +12464,7 @@
       </w:r>
     </w:p>
   </w:footnote>
-  <w:footnote w:id="153">
+  <w:footnote w:id="154">
     <w:p>
       <w:pPr>
         <w:bidi/>
@@ -12473,7 +12508,7 @@
       </w:r>
     </w:p>
   </w:footnote>
-  <w:footnote w:id="154">
+  <w:footnote w:id="155">
     <w:p>
       <w:pPr>
         <w:bidi/>
@@ -12517,7 +12552,7 @@
       </w:r>
     </w:p>
   </w:footnote>
-  <w:footnote w:id="155">
+  <w:footnote w:id="156">
     <w:p>
       <w:pPr>
         <w:bidi/>
@@ -12541,7 +12576,7 @@
       </w:r>
     </w:p>
   </w:footnote>
-  <w:footnote w:id="156">
+  <w:footnote w:id="157">
     <w:p>
       <w:pPr>
         <w:bidi/>
@@ -12585,7 +12620,7 @@
       </w:r>
     </w:p>
   </w:footnote>
-  <w:footnote w:id="157">
+  <w:footnote w:id="158">
     <w:p>
       <w:pPr>
         <w:bidi/>
@@ -12609,7 +12644,7 @@
       </w:r>
     </w:p>
   </w:footnote>
-  <w:footnote w:id="158">
+  <w:footnote w:id="159">
     <w:p>
       <w:pPr>
         <w:bidi/>
@@ -12653,7 +12688,7 @@
       </w:r>
     </w:p>
   </w:footnote>
-  <w:footnote w:id="159">
+  <w:footnote w:id="160">
     <w:p>
       <w:pPr>
         <w:bidi/>
@@ -12697,7 +12732,7 @@
       </w:r>
     </w:p>
   </w:footnote>
-  <w:footnote w:id="160">
+  <w:footnote w:id="161">
     <w:p>
       <w:pPr>
         <w:bidi/>
@@ -12741,7 +12776,7 @@
       </w:r>
     </w:p>
   </w:footnote>
-  <w:footnote w:id="161">
+  <w:footnote w:id="162">
     <w:p>
       <w:pPr>
         <w:bidi/>
@@ -12843,31 +12878,31 @@
       </w:r>
     </w:p>
   </w:footnote>
-  <w:footnote w:id="162">
-    <w:p>
-      <w:pPr>
-        <w:bidi/>
-        <w:spacing w:after="40" w:line="240"/>
-        <w:jc w:val="both"/>
-      </w:pPr>
-      <w:r>
-        <w:rPr>
-          <w:rStyle w:val="FootnoteReference"/>
-        </w:rPr>
-        <w:footnoteRef/>
-      </w:r>
-      <w:r>
-        <w:rPr>
-          <w:rFonts w:ascii="David" w:cs="David" w:eastAsia="David" w:hAnsi="David"/>
-          <w:sz w:val="20"/>
-          <w:szCs w:val="20"/>
-          <w:rtl/>
-        </w:rPr>
-        <w:t xml:space="preserve"> סגל, לעיל ה"ש 161, בעמ' 155.</w:t>
-      </w:r>
-    </w:p>
-  </w:footnote>
   <w:footnote w:id="163">
+    <w:p>
+      <w:pPr>
+        <w:bidi/>
+        <w:spacing w:after="40" w:line="240"/>
+        <w:jc w:val="both"/>
+      </w:pPr>
+      <w:r>
+        <w:rPr>
+          <w:rStyle w:val="FootnoteReference"/>
+        </w:rPr>
+        <w:footnoteRef/>
+      </w:r>
+      <w:r>
+        <w:rPr>
+          <w:rFonts w:ascii="David" w:cs="David" w:eastAsia="David" w:hAnsi="David"/>
+          <w:sz w:val="20"/>
+          <w:szCs w:val="20"/>
+          <w:rtl/>
+        </w:rPr>
+        <w:t xml:space="preserve"> סגל, לעיל ה"ש 162, בעמ' 155.</w:t>
+      </w:r>
+    </w:p>
+  </w:footnote>
+  <w:footnote w:id="164">
     <w:p>
       <w:pPr>
         <w:bidi/>
@@ -12911,7 +12946,7 @@
       </w:r>
     </w:p>
   </w:footnote>
-  <w:footnote w:id="164">
+  <w:footnote w:id="165">
     <w:p>
       <w:pPr>
         <w:bidi/>
@@ -12955,7 +12990,7 @@
       </w:r>
     </w:p>
   </w:footnote>
-  <w:footnote w:id="165">
+  <w:footnote w:id="166">
     <w:p>
       <w:pPr>
         <w:bidi/>
@@ -12999,7 +13034,7 @@
       </w:r>
     </w:p>
   </w:footnote>
-  <w:footnote w:id="166">
+  <w:footnote w:id="167">
     <w:p>
       <w:pPr>
         <w:bidi/>
@@ -13037,7 +13072,7 @@
           <w:szCs w:val="20"/>
           <w:rtl/>
         </w:rPr>
-        <w:t xml:space="preserve">, לעיל ה"ש 146, בפס' </w:t>
+        <w:t xml:space="preserve">, לעיל ה"ש 147, בפס' </w:t>
       </w:r>
       <w:r>
         <w:rPr>
@@ -13050,7 +13085,7 @@
       </w:r>
     </w:p>
   </w:footnote>
-  <w:footnote w:id="167">
+  <w:footnote w:id="168">
     <w:p>
       <w:pPr>
         <w:bidi/>
@@ -13094,7 +13129,7 @@
       </w:r>
     </w:p>
   </w:footnote>
-  <w:footnote w:id="168">
+  <w:footnote w:id="169">
     <w:p>
       <w:pPr>
         <w:bidi/>
@@ -13132,11 +13167,11 @@
           <w:szCs w:val="20"/>
           <w:rtl/>
         </w:rPr>
-        <w:t xml:space="preserve">, לעיל ה"ש 146, בפס' 5.1-5.4.</w:t>
-      </w:r>
-    </w:p>
-  </w:footnote>
-  <w:footnote w:id="169">
+        <w:t xml:space="preserve">, לעיל ה"ש 147, בפס' 5.1-5.4.</w:t>
+      </w:r>
+    </w:p>
+  </w:footnote>
+  <w:footnote w:id="170">
     <w:p>
       <w:pPr>
         <w:bidi/>
@@ -13180,7 +13215,7 @@
       </w:r>
     </w:p>
   </w:footnote>
-  <w:footnote w:id="170">
+  <w:footnote w:id="171">
     <w:p>
       <w:pPr>
         <w:bidi/>
@@ -13204,7 +13239,7 @@
       </w:r>
     </w:p>
   </w:footnote>
-  <w:footnote w:id="171">
+  <w:footnote w:id="172">
     <w:p>
       <w:pPr>
         <w:bidi/>
@@ -13228,7 +13263,7 @@
       </w:r>
     </w:p>
   </w:footnote>
-  <w:footnote w:id="172">
+  <w:footnote w:id="173">
     <w:p>
       <w:pPr>
         <w:bidi/>
@@ -13272,7 +13307,7 @@
       </w:r>
     </w:p>
   </w:footnote>
-  <w:footnote w:id="173">
+  <w:footnote w:id="174">
     <w:p>
       <w:pPr>
         <w:bidi/>
@@ -13296,7 +13331,7 @@
       </w:r>
     </w:p>
   </w:footnote>
-  <w:footnote w:id="174">
+  <w:footnote w:id="175">
     <w:p>
       <w:pPr>
         <w:bidi/>
@@ -13320,7 +13355,7 @@
       </w:r>
     </w:p>
   </w:footnote>
-  <w:footnote w:id="175">
+  <w:footnote w:id="176">
     <w:p>
       <w:pPr>
         <w:bidi/>
@@ -13344,7 +13379,7 @@
       </w:r>
     </w:p>
   </w:footnote>
-  <w:footnote w:id="176">
+  <w:footnote w:id="177">
     <w:p>
       <w:pPr>
         <w:bidi/>
@@ -13368,27 +13403,27 @@
       </w:r>
     </w:p>
   </w:footnote>
-  <w:footnote w:id="177">
-    <w:p>
-      <w:pPr>
-        <w:bidi/>
-        <w:spacing w:after="40" w:line="240"/>
-        <w:jc w:val="both"/>
-      </w:pPr>
-      <w:r>
-        <w:rPr>
-          <w:rStyle w:val="FootnoteReference"/>
-        </w:rPr>
-        <w:footnoteRef/>
-      </w:r>
-      <w:r>
-        <w:rPr>
-          <w:rFonts w:ascii="David" w:cs="David" w:eastAsia="David" w:hAnsi="David"/>
-          <w:sz w:val="20"/>
-          <w:szCs w:val="20"/>
-          <w:rtl/>
-        </w:rPr>
-        <w:t xml:space="preserve"> סגל, לעיל ה"ש 161, בעמ' 132-131; </w:t>
+  <w:footnote w:id="178">
+    <w:p>
+      <w:pPr>
+        <w:bidi/>
+        <w:spacing w:after="40" w:line="240"/>
+        <w:jc w:val="both"/>
+      </w:pPr>
+      <w:r>
+        <w:rPr>
+          <w:rStyle w:val="FootnoteReference"/>
+        </w:rPr>
+        <w:footnoteRef/>
+      </w:r>
+      <w:r>
+        <w:rPr>
+          <w:rFonts w:ascii="David" w:cs="David" w:eastAsia="David" w:hAnsi="David"/>
+          <w:sz w:val="20"/>
+          <w:szCs w:val="20"/>
+          <w:rtl/>
+        </w:rPr>
+        <w:t xml:space="preserve"> סגל, לעיל ה"ש 162, בעמ' 132-131; </w:t>
       </w:r>
       <w:r>
         <w:rPr>
@@ -13412,31 +13447,31 @@
       </w:r>
     </w:p>
   </w:footnote>
-  <w:footnote w:id="178">
-    <w:p>
-      <w:pPr>
-        <w:bidi/>
-        <w:spacing w:after="40" w:line="240"/>
-        <w:jc w:val="both"/>
-      </w:pPr>
-      <w:r>
-        <w:rPr>
-          <w:rStyle w:val="FootnoteReference"/>
-        </w:rPr>
-        <w:footnoteRef/>
-      </w:r>
-      <w:r>
-        <w:rPr>
-          <w:rFonts w:ascii="David" w:cs="David" w:eastAsia="David" w:hAnsi="David"/>
-          <w:sz w:val="20"/>
-          <w:szCs w:val="20"/>
-          <w:rtl/>
-        </w:rPr>
-        <w:t xml:space="preserve"> גלעד, לעיל ה"ש 163, בעמ' 1089-1086.</w:t>
-      </w:r>
-    </w:p>
-  </w:footnote>
   <w:footnote w:id="179">
+    <w:p>
+      <w:pPr>
+        <w:bidi/>
+        <w:spacing w:after="40" w:line="240"/>
+        <w:jc w:val="both"/>
+      </w:pPr>
+      <w:r>
+        <w:rPr>
+          <w:rStyle w:val="FootnoteReference"/>
+        </w:rPr>
+        <w:footnoteRef/>
+      </w:r>
+      <w:r>
+        <w:rPr>
+          <w:rFonts w:ascii="David" w:cs="David" w:eastAsia="David" w:hAnsi="David"/>
+          <w:sz w:val="20"/>
+          <w:szCs w:val="20"/>
+          <w:rtl/>
+        </w:rPr>
+        <w:t xml:space="preserve"> גלעד, לעיל ה"ש 164, בעמ' 1089-1086.</w:t>
+      </w:r>
+    </w:p>
+  </w:footnote>
+  <w:footnote w:id="180">
     <w:p>
       <w:pPr>
         <w:bidi/>
@@ -13494,11 +13529,11 @@
           <w:szCs w:val="20"/>
           <w:rtl/>
         </w:rPr>
-        <w:t xml:space="preserve">; גלעד, לעיל ה"ש 163, בעמ' 1085.</w:t>
-      </w:r>
-    </w:p>
-  </w:footnote>
-  <w:footnote w:id="180">
+        <w:t xml:space="preserve">; גלעד, לעיל ה"ש 164, בעמ' 1085.</w:t>
+      </w:r>
+    </w:p>
+  </w:footnote>
+  <w:footnote w:id="181">
     <w:p>
       <w:pPr>
         <w:bidi/>
@@ -13556,11 +13591,11 @@
           <w:szCs w:val="20"/>
           <w:rtl/>
         </w:rPr>
-        <w:t xml:space="preserve">; סגל, לעיל ה"ש 161, בעמ' 181.</w:t>
-      </w:r>
-    </w:p>
-  </w:footnote>
-  <w:footnote w:id="181">
+        <w:t xml:space="preserve">; סגל, לעיל ה"ש 162, בעמ' 181.</w:t>
+      </w:r>
+    </w:p>
+  </w:footnote>
+  <w:footnote w:id="182">
     <w:p>
       <w:pPr>
         <w:bidi/>
@@ -13604,7 +13639,7 @@
       </w:r>
     </w:p>
   </w:footnote>
-  <w:footnote w:id="182">
+  <w:footnote w:id="183">
     <w:p>
       <w:pPr>
         <w:bidi/>
@@ -13648,7 +13683,7 @@
       </w:r>
     </w:p>
   </w:footnote>
-  <w:footnote w:id="183">
+  <w:footnote w:id="184">
     <w:p>
       <w:pPr>
         <w:bidi/>
@@ -13692,7 +13727,7 @@
       </w:r>
     </w:p>
   </w:footnote>
-  <w:footnote w:id="184">
+  <w:footnote w:id="185">
     <w:p>
       <w:pPr>
         <w:bidi/>
@@ -13730,11 +13765,11 @@
           <w:szCs w:val="20"/>
           <w:rtl/>
         </w:rPr>
-        <w:t xml:space="preserve">, לעיל ה"ש 174, בעמ' 6.</w:t>
-      </w:r>
-    </w:p>
-  </w:footnote>
-  <w:footnote w:id="185">
+        <w:t xml:space="preserve">, לעיל ה"ש 175, בעמ' 6.</w:t>
+      </w:r>
+    </w:p>
+  </w:footnote>
+  <w:footnote w:id="186">
     <w:p>
       <w:pPr>
         <w:bidi/>
@@ -13758,31 +13793,31 @@
       </w:r>
     </w:p>
   </w:footnote>
-  <w:footnote w:id="186">
-    <w:p>
-      <w:pPr>
-        <w:bidi/>
-        <w:spacing w:after="40" w:line="240"/>
-        <w:jc w:val="both"/>
-      </w:pPr>
-      <w:r>
-        <w:rPr>
-          <w:rStyle w:val="FootnoteReference"/>
-        </w:rPr>
-        <w:footnoteRef/>
-      </w:r>
-      <w:r>
-        <w:rPr>
-          <w:rFonts w:ascii="David" w:cs="David" w:eastAsia="David" w:hAnsi="David"/>
-          <w:sz w:val="20"/>
-          <w:szCs w:val="20"/>
-          <w:rtl/>
-        </w:rPr>
-        <w:t xml:space="preserve"> סגל, לעיל ה"ש 161, בעמ' 156.</w:t>
-      </w:r>
-    </w:p>
-  </w:footnote>
   <w:footnote w:id="187">
+    <w:p>
+      <w:pPr>
+        <w:bidi/>
+        <w:spacing w:after="40" w:line="240"/>
+        <w:jc w:val="both"/>
+      </w:pPr>
+      <w:r>
+        <w:rPr>
+          <w:rStyle w:val="FootnoteReference"/>
+        </w:rPr>
+        <w:footnoteRef/>
+      </w:r>
+      <w:r>
+        <w:rPr>
+          <w:rFonts w:ascii="David" w:cs="David" w:eastAsia="David" w:hAnsi="David"/>
+          <w:sz w:val="20"/>
+          <w:szCs w:val="20"/>
+          <w:rtl/>
+        </w:rPr>
+        <w:t xml:space="preserve"> סגל, לעיל ה"ש 162, בעמ' 156.</w:t>
+      </w:r>
+    </w:p>
+  </w:footnote>
+  <w:footnote w:id="188">
     <w:p>
       <w:pPr>
         <w:bidi/>
@@ -13846,31 +13881,31 @@
       </w:r>
     </w:p>
   </w:footnote>
-  <w:footnote w:id="188">
-    <w:p>
-      <w:pPr>
-        <w:bidi/>
-        <w:spacing w:after="40" w:line="240"/>
-        <w:jc w:val="both"/>
-      </w:pPr>
-      <w:r>
-        <w:rPr>
-          <w:rStyle w:val="FootnoteReference"/>
-        </w:rPr>
-        <w:footnoteRef/>
-      </w:r>
-      <w:r>
-        <w:rPr>
-          <w:rFonts w:ascii="David" w:cs="David" w:eastAsia="David" w:hAnsi="David"/>
-          <w:sz w:val="20"/>
-          <w:szCs w:val="20"/>
-          <w:rtl/>
-        </w:rPr>
-        <w:t xml:space="preserve"> ס' 3 לחוק הנזיקים האזרחיים (אחריות המדינה), התשי"ב–1952; סגל, לעיל ה"ש 161, בעמ' 141.</w:t>
-      </w:r>
-    </w:p>
-  </w:footnote>
   <w:footnote w:id="189">
+    <w:p>
+      <w:pPr>
+        <w:bidi/>
+        <w:spacing w:after="40" w:line="240"/>
+        <w:jc w:val="both"/>
+      </w:pPr>
+      <w:r>
+        <w:rPr>
+          <w:rStyle w:val="FootnoteReference"/>
+        </w:rPr>
+        <w:footnoteRef/>
+      </w:r>
+      <w:r>
+        <w:rPr>
+          <w:rFonts w:ascii="David" w:cs="David" w:eastAsia="David" w:hAnsi="David"/>
+          <w:sz w:val="20"/>
+          <w:szCs w:val="20"/>
+          <w:rtl/>
+        </w:rPr>
+        <w:t xml:space="preserve"> ס' 3 לחוק הנזיקים האזרחיים (אחריות המדינה), התשי"ב–1952; סגל, לעיל ה"ש 162, בעמ' 141.</w:t>
+      </w:r>
+    </w:p>
+  </w:footnote>
+  <w:footnote w:id="190">
     <w:p>
       <w:pPr>
         <w:bidi/>
@@ -13910,31 +13945,7 @@
           <w:szCs w:val="20"/>
           <w:rtl/>
         </w:rPr>
-        <w:t xml:space="preserve"> (נבו 10.4.2019); סגל, לעיל ה"ש 161, בעמ' 209.</w:t>
-      </w:r>
-    </w:p>
-  </w:footnote>
-  <w:footnote w:id="190">
-    <w:p>
-      <w:pPr>
-        <w:bidi/>
-        <w:spacing w:after="40" w:line="240"/>
-        <w:jc w:val="both"/>
-      </w:pPr>
-      <w:r>
-        <w:rPr>
-          <w:rStyle w:val="FootnoteReference"/>
-        </w:rPr>
-        <w:footnoteRef/>
-      </w:r>
-      <w:r>
-        <w:rPr>
-          <w:rFonts w:ascii="David" w:cs="David" w:eastAsia="David" w:hAnsi="David"/>
-          <w:sz w:val="20"/>
-          <w:szCs w:val="20"/>
-          <w:rtl/>
-        </w:rPr>
-        <w:t xml:space="preserve"> גלעד, לעיל ה"ש 163, בעמ' 1062.</w:t>
+        <w:t xml:space="preserve"> (נבו 10.4.2019); סגל, לעיל ה"ש 162, בעמ' 209.</w:t>
       </w:r>
     </w:p>
   </w:footnote>
@@ -13958,11 +13969,35 @@
           <w:szCs w:val="20"/>
           <w:rtl/>
         </w:rPr>
+        <w:t xml:space="preserve"> גלעד, לעיל ה"ש 164, בעמ' 1062.</w:t>
+      </w:r>
+    </w:p>
+  </w:footnote>
+  <w:footnote w:id="192">
+    <w:p>
+      <w:pPr>
+        <w:bidi/>
+        <w:spacing w:after="40" w:line="240"/>
+        <w:jc w:val="both"/>
+      </w:pPr>
+      <w:r>
+        <w:rPr>
+          <w:rStyle w:val="FootnoteReference"/>
+        </w:rPr>
+        <w:footnoteRef/>
+      </w:r>
+      <w:r>
+        <w:rPr>
+          <w:rFonts w:ascii="David" w:cs="David" w:eastAsia="David" w:hAnsi="David"/>
+          <w:sz w:val="20"/>
+          <w:szCs w:val="20"/>
+          <w:rtl/>
+        </w:rPr>
         <w:t xml:space="preserve"> דרומי, לעיל ה"ש 117, בעמ' 227.</w:t>
       </w:r>
     </w:p>
   </w:footnote>
-  <w:footnote w:id="192">
+  <w:footnote w:id="193">
     <w:p>
       <w:pPr>
         <w:bidi/>
@@ -14006,7 +14041,7 @@
       </w:r>
     </w:p>
   </w:footnote>
-  <w:footnote w:id="193">
+  <w:footnote w:id="194">
     <w:p>
       <w:pPr>
         <w:bidi/>
@@ -14046,11 +14081,11 @@
           <w:szCs w:val="20"/>
           <w:rtl/>
         </w:rPr>
-        <w:t xml:space="preserve">, פ"ד לח(3) 337 (1984); סגל, לעיל ה"ש 161, בעמ' 196.</w:t>
-      </w:r>
-    </w:p>
-  </w:footnote>
-  <w:footnote w:id="194">
+        <w:t xml:space="preserve">, פ"ד לח(3) 337 (1984); סגל, לעיל ה"ש 162, בעמ' 196.</w:t>
+      </w:r>
+    </w:p>
+  </w:footnote>
+  <w:footnote w:id="195">
     <w:p>
       <w:pPr>
         <w:bidi/>
@@ -14094,7 +14129,7 @@
       </w:r>
     </w:p>
   </w:footnote>
-  <w:footnote w:id="195">
+  <w:footnote w:id="196">
     <w:p>
       <w:pPr>
         <w:bidi/>
@@ -14132,11 +14167,11 @@
           <w:szCs w:val="20"/>
           <w:rtl/>
         </w:rPr>
-        <w:t xml:space="preserve">, לעיל ה"ש 170, בפס' 1.1-1.3.</w:t>
-      </w:r>
-    </w:p>
-  </w:footnote>
-  <w:footnote w:id="196">
+        <w:t xml:space="preserve">, לעיל ה"ש 171, בפס' 1.1-1.3.</w:t>
+      </w:r>
+    </w:p>
+  </w:footnote>
+  <w:footnote w:id="197">
     <w:p>
       <w:pPr>
         <w:bidi/>
@@ -14174,11 +14209,11 @@
           <w:szCs w:val="20"/>
           <w:rtl/>
         </w:rPr>
-        <w:t xml:space="preserve">, לעיל ה"ש 174, בעמ' 5.</w:t>
-      </w:r>
-    </w:p>
-  </w:footnote>
-  <w:footnote w:id="197">
+        <w:t xml:space="preserve">, לעיל ה"ש 175, בעמ' 5.</w:t>
+      </w:r>
+    </w:p>
+  </w:footnote>
+  <w:footnote w:id="198">
     <w:p>
       <w:pPr>
         <w:bidi/>
@@ -14220,7 +14255,7 @@
       </w:r>
     </w:p>
   </w:footnote>
-  <w:footnote w:id="198">
+  <w:footnote w:id="199">
     <w:p>
       <w:pPr>
         <w:bidi/>
@@ -14280,7 +14315,7 @@
       </w:r>
     </w:p>
   </w:footnote>
-  <w:footnote w:id="199">
+  <w:footnote w:id="200">
     <w:p>
       <w:pPr>
         <w:bidi/>
@@ -14304,30 +14339,6 @@
       </w:r>
     </w:p>
   </w:footnote>
-  <w:footnote w:id="200">
-    <w:p>
-      <w:pPr>
-        <w:bidi/>
-        <w:spacing w:after="40" w:line="240"/>
-        <w:jc w:val="both"/>
-      </w:pPr>
-      <w:r>
-        <w:rPr>
-          <w:rStyle w:val="FootnoteReference"/>
-        </w:rPr>
-        <w:footnoteRef/>
-      </w:r>
-      <w:r>
-        <w:rPr>
-          <w:rFonts w:ascii="David" w:cs="David" w:eastAsia="David" w:hAnsi="David"/>
-          <w:sz w:val="20"/>
-          <w:szCs w:val="20"/>
-          <w:rtl/>
-        </w:rPr>
-        <w:t xml:space="preserve"> חסייסי ואחרים "עבירות אלימות", לעיל ה"ש 129, בעמ' 248; ליטמנוביץ ואחרים, לעיל ה"ש 34, בעמ' 240.</w:t>
-      </w:r>
-    </w:p>
-  </w:footnote>
   <w:footnote w:id="201">
     <w:p>
       <w:pPr>
@@ -14348,6 +14359,30 @@
           <w:szCs w:val="20"/>
           <w:rtl/>
         </w:rPr>
+        <w:t xml:space="preserve"> חסייסי ואחרים "עבירות אלימות", לעיל ה"ש 130, בעמ' 248; ליטמנוביץ ואחרים, לעיל ה"ש 34, בעמ' 240.</w:t>
+      </w:r>
+    </w:p>
+  </w:footnote>
+  <w:footnote w:id="202">
+    <w:p>
+      <w:pPr>
+        <w:bidi/>
+        <w:spacing w:after="40" w:line="240"/>
+        <w:jc w:val="both"/>
+      </w:pPr>
+      <w:r>
+        <w:rPr>
+          <w:rStyle w:val="FootnoteReference"/>
+        </w:rPr>
+        <w:footnoteRef/>
+      </w:r>
+      <w:r>
+        <w:rPr>
+          <w:rFonts w:ascii="David" w:cs="David" w:eastAsia="David" w:hAnsi="David"/>
+          <w:sz w:val="20"/>
+          <w:szCs w:val="20"/>
+          <w:rtl/>
+        </w:rPr>
         <w:t xml:space="preserve"> </w:t>
       </w:r>
       <w:r>
@@ -14370,7 +14405,7 @@
       </w:r>
     </w:p>
   </w:footnote>
-  <w:footnote w:id="202">
+  <w:footnote w:id="203">
     <w:p>
       <w:pPr>
         <w:bidi/>
@@ -14394,7 +14429,7 @@
       </w:r>
     </w:p>
   </w:footnote>
-  <w:footnote w:id="203">
+  <w:footnote w:id="204">
     <w:p>
       <w:pPr>
         <w:bidi/>
@@ -14438,7 +14473,7 @@
       </w:r>
     </w:p>
   </w:footnote>
-  <w:footnote w:id="204">
+  <w:footnote w:id="205">
     <w:p>
       <w:pPr>
         <w:bidi/>
@@ -14462,7 +14497,7 @@
       </w:r>
     </w:p>
   </w:footnote>
-  <w:footnote w:id="205">
+  <w:footnote w:id="206">
     <w:p>
       <w:pPr>
         <w:bidi/>
@@ -14486,7 +14521,7 @@
       </w:r>
     </w:p>
   </w:footnote>
-  <w:footnote w:id="206">
+  <w:footnote w:id="207">
     <w:p>
       <w:pPr>
         <w:bidi/>
@@ -14537,7 +14572,7 @@
       </w:r>
     </w:p>
   </w:footnote>
-  <w:footnote w:id="207">
+  <w:footnote w:id="208">
     <w:p>
       <w:pPr>
         <w:bidi/>
@@ -14561,7 +14596,7 @@
       </w:r>
     </w:p>
   </w:footnote>
-  <w:footnote w:id="208">
+  <w:footnote w:id="209">
     <w:p>
       <w:pPr>
         <w:bidi/>
@@ -14585,7 +14620,7 @@
       </w:r>
     </w:p>
   </w:footnote>
-  <w:footnote w:id="209">
+  <w:footnote w:id="210">
     <w:p>
       <w:pPr>
         <w:bidi/>
@@ -14609,7 +14644,7 @@
       </w:r>
     </w:p>
   </w:footnote>
-  <w:footnote w:id="210">
+  <w:footnote w:id="211">
     <w:p>
       <w:pPr>
         <w:bidi/>
@@ -14633,7 +14668,7 @@
       </w:r>
     </w:p>
   </w:footnote>
-  <w:footnote w:id="211">
+  <w:footnote w:id="212">
     <w:p>
       <w:pPr>
         <w:bidi/>
@@ -14657,7 +14692,7 @@
       </w:r>
     </w:p>
   </w:footnote>
-  <w:footnote w:id="212">
+  <w:footnote w:id="213">
     <w:p>
       <w:pPr>
         <w:bidi/>
@@ -14681,7 +14716,7 @@
       </w:r>
     </w:p>
   </w:footnote>
-  <w:footnote w:id="213">
+  <w:footnote w:id="214">
     <w:p>
       <w:pPr>
         <w:bidi/>
@@ -14725,7 +14760,31 @@
       </w:r>
     </w:p>
   </w:footnote>
-  <w:footnote w:id="214">
+  <w:footnote w:id="215">
+    <w:p>
+      <w:pPr>
+        <w:bidi/>
+        <w:spacing w:after="40" w:line="240"/>
+        <w:jc w:val="both"/>
+      </w:pPr>
+      <w:r>
+        <w:rPr>
+          <w:rStyle w:val="FootnoteReference"/>
+        </w:rPr>
+        <w:footnoteRef/>
+      </w:r>
+      <w:r>
+        <w:rPr>
+          <w:rFonts w:ascii="David" w:cs="David" w:eastAsia="David" w:hAnsi="David"/>
+          <w:sz w:val="20"/>
+          <w:szCs w:val="20"/>
+          <w:rtl/>
+        </w:rPr>
+        <w:t xml:space="preserve"> פדן, לעיל ה"ש 67, בעמ' 430 וה"ש 67.</w:t>
+      </w:r>
+    </w:p>
+  </w:footnote>
+  <w:footnote w:id="216">
     <w:p>
       <w:pPr>
         <w:bidi/>
@@ -14749,7 +14808,7 @@
       </w:r>
     </w:p>
   </w:footnote>
-  <w:footnote w:id="215">
+  <w:footnote w:id="217">
     <w:p>
       <w:pPr>
         <w:bidi/>
@@ -14793,7 +14852,7 @@
       </w:r>
     </w:p>
   </w:footnote>
-  <w:footnote w:id="216">
+  <w:footnote w:id="218">
     <w:p>
       <w:pPr>
         <w:bidi/>
@@ -14837,7 +14896,7 @@
       </w:r>
     </w:p>
   </w:footnote>
-  <w:footnote w:id="217">
+  <w:footnote w:id="219">
     <w:p>
       <w:pPr>
         <w:bidi/>
@@ -14881,7 +14940,7 @@
       </w:r>
     </w:p>
   </w:footnote>
-  <w:footnote w:id="218">
+  <w:footnote w:id="220">
     <w:p>
       <w:pPr>
         <w:bidi/>
@@ -14923,7 +14982,7 @@
       </w:r>
     </w:p>
   </w:footnote>
-  <w:footnote w:id="219">
+  <w:footnote w:id="221">
     <w:p>
       <w:pPr>
         <w:bidi/>
@@ -14947,7 +15006,7 @@
       </w:r>
     </w:p>
   </w:footnote>
-  <w:footnote w:id="220">
+  <w:footnote w:id="222">
     <w:p>
       <w:pPr>
         <w:bidi/>
@@ -14971,7 +15030,7 @@
       </w:r>
     </w:p>
   </w:footnote>
-  <w:footnote w:id="221">
+  <w:footnote w:id="223">
     <w:p>
       <w:pPr>
         <w:bidi/>
@@ -15015,7 +15074,7 @@
       </w:r>
     </w:p>
   </w:footnote>
-  <w:footnote w:id="222">
+  <w:footnote w:id="224">
     <w:p>
       <w:pPr>
         <w:bidi/>
@@ -15059,31 +15118,31 @@
       </w:r>
     </w:p>
   </w:footnote>
-  <w:footnote w:id="223">
-    <w:p>
-      <w:pPr>
-        <w:bidi/>
-        <w:spacing w:after="40" w:line="240"/>
-        <w:jc w:val="both"/>
-      </w:pPr>
-      <w:r>
-        <w:rPr>
-          <w:rStyle w:val="FootnoteReference"/>
-        </w:rPr>
-        <w:footnoteRef/>
-      </w:r>
-      <w:r>
-        <w:rPr>
-          <w:rFonts w:ascii="David" w:cs="David" w:eastAsia="David" w:hAnsi="David"/>
-          <w:sz w:val="20"/>
-          <w:szCs w:val="20"/>
-          <w:rtl/>
-        </w:rPr>
-        <w:t xml:space="preserve"> חסייסי ואחרים "עמדות הציבור", לעיל ה"ש 141, בעמ' 304, 302.</w:t>
-      </w:r>
-    </w:p>
-  </w:footnote>
-  <w:footnote w:id="224">
+  <w:footnote w:id="225">
+    <w:p>
+      <w:pPr>
+        <w:bidi/>
+        <w:spacing w:after="40" w:line="240"/>
+        <w:jc w:val="both"/>
+      </w:pPr>
+      <w:r>
+        <w:rPr>
+          <w:rStyle w:val="FootnoteReference"/>
+        </w:rPr>
+        <w:footnoteRef/>
+      </w:r>
+      <w:r>
+        <w:rPr>
+          <w:rFonts w:ascii="David" w:cs="David" w:eastAsia="David" w:hAnsi="David"/>
+          <w:sz w:val="20"/>
+          <w:szCs w:val="20"/>
+          <w:rtl/>
+        </w:rPr>
+        <w:t xml:space="preserve"> חסייסי ואחרים "עמדות הציבור", לעיל ה"ש 142, בעמ' 304, 302.</w:t>
+      </w:r>
+    </w:p>
+  </w:footnote>
+  <w:footnote w:id="226">
     <w:p>
       <w:pPr>
         <w:bidi/>
@@ -15125,7 +15184,7 @@
       </w:r>
     </w:p>
   </w:footnote>
-  <w:footnote w:id="225">
+  <w:footnote w:id="227">
     <w:p>
       <w:pPr>
         <w:bidi/>
@@ -15169,31 +15228,31 @@
       </w:r>
     </w:p>
   </w:footnote>
-  <w:footnote w:id="226">
-    <w:p>
-      <w:pPr>
-        <w:bidi/>
-        <w:spacing w:after="40" w:line="240"/>
-        <w:jc w:val="both"/>
-      </w:pPr>
-      <w:r>
-        <w:rPr>
-          <w:rStyle w:val="FootnoteReference"/>
-        </w:rPr>
-        <w:footnoteRef/>
-      </w:r>
-      <w:r>
-        <w:rPr>
-          <w:rFonts w:ascii="David" w:cs="David" w:eastAsia="David" w:hAnsi="David"/>
-          <w:sz w:val="20"/>
-          <w:szCs w:val="20"/>
-          <w:rtl/>
-        </w:rPr>
-        <w:t xml:space="preserve"> הרדוף "ויתור, הידברות, בג"ץ", לעיל ה"ש 222, בעמ' 1843.</w:t>
-      </w:r>
-    </w:p>
-  </w:footnote>
-  <w:footnote w:id="227">
+  <w:footnote w:id="228">
+    <w:p>
+      <w:pPr>
+        <w:bidi/>
+        <w:spacing w:after="40" w:line="240"/>
+        <w:jc w:val="both"/>
+      </w:pPr>
+      <w:r>
+        <w:rPr>
+          <w:rStyle w:val="FootnoteReference"/>
+        </w:rPr>
+        <w:footnoteRef/>
+      </w:r>
+      <w:r>
+        <w:rPr>
+          <w:rFonts w:ascii="David" w:cs="David" w:eastAsia="David" w:hAnsi="David"/>
+          <w:sz w:val="20"/>
+          <w:szCs w:val="20"/>
+          <w:rtl/>
+        </w:rPr>
+        <w:t xml:space="preserve"> הרדוף "ויתור, הידברות, בג"ץ", לעיל ה"ש 224, בעמ' 1843.</w:t>
+      </w:r>
+    </w:p>
+  </w:footnote>
+  <w:footnote w:id="229">
     <w:p>
       <w:pPr>
         <w:bidi/>
@@ -15231,7 +15290,7 @@
           <w:szCs w:val="20"/>
           <w:rtl/>
         </w:rPr>
-        <w:t xml:space="preserve">, לעיל ה"ש 146, בפס' </w:t>
+        <w:t xml:space="preserve">, לעיל ה"ש 147, בפס' </w:t>
       </w:r>
       <w:r>
         <w:rPr>
@@ -15244,7 +15303,7 @@
       </w:r>
     </w:p>
   </w:footnote>
-  <w:footnote w:id="228">
+  <w:footnote w:id="230">
     <w:p>
       <w:pPr>
         <w:bidi/>
@@ -15282,11 +15341,11 @@
           <w:szCs w:val="20"/>
           <w:rtl/>
         </w:rPr>
-        <w:t xml:space="preserve">, לעיל ה"ש 170, בהמלצה 61.</w:t>
-      </w:r>
-    </w:p>
-  </w:footnote>
-  <w:footnote w:id="229">
+        <w:t xml:space="preserve">, לעיל ה"ש 171, בהמלצה 61.</w:t>
+      </w:r>
+    </w:p>
+  </w:footnote>
+  <w:footnote w:id="231">
     <w:p>
       <w:pPr>
         <w:bidi/>
@@ -15324,11 +15383,11 @@
           <w:szCs w:val="20"/>
           <w:rtl/>
         </w:rPr>
-        <w:t xml:space="preserve">, לעיל ה"ש 146, בפס' 5.1.</w:t>
-      </w:r>
-    </w:p>
-  </w:footnote>
-  <w:footnote w:id="230">
+        <w:t xml:space="preserve">, לעיל ה"ש 147, בפס' 5.1.</w:t>
+      </w:r>
+    </w:p>
+  </w:footnote>
+  <w:footnote w:id="232">
     <w:p>
       <w:pPr>
         <w:bidi/>
@@ -15368,11 +15427,11 @@
           <w:szCs w:val="20"/>
           <w:rtl/>
         </w:rPr>
-        <w:t xml:space="preserve">, לעיל ה"ש 172, בפס' 44-47.</w:t>
-      </w:r>
-    </w:p>
-  </w:footnote>
-  <w:footnote w:id="231">
+        <w:t xml:space="preserve">, לעיל ה"ש 173, בפס' 44-47.</w:t>
+      </w:r>
+    </w:p>
+  </w:footnote>
+  <w:footnote w:id="233">
     <w:p>
       <w:pPr>
         <w:bidi/>
@@ -15396,7 +15455,7 @@
       </w:r>
     </w:p>
   </w:footnote>
-  <w:footnote w:id="232">
+  <w:footnote w:id="234">
     <w:p>
       <w:pPr>
         <w:bidi/>
@@ -15440,7 +15499,7 @@
       </w:r>
     </w:p>
   </w:footnote>
-  <w:footnote w:id="233">
+  <w:footnote w:id="235">
     <w:p>
       <w:pPr>
         <w:bidi/>
@@ -15464,7 +15523,7 @@
       </w:r>
     </w:p>
   </w:footnote>
-  <w:footnote w:id="234">
+  <w:footnote w:id="236">
     <w:p>
       <w:pPr>
         <w:bidi/>
@@ -15526,7 +15585,7 @@
       </w:r>
     </w:p>
   </w:footnote>
-  <w:footnote w:id="235">
+  <w:footnote w:id="237">
     <w:p>
       <w:pPr>
         <w:bidi/>
@@ -15608,7 +15667,7 @@
       </w:r>
     </w:p>
   </w:footnote>
-  <w:footnote w:id="236">
+  <w:footnote w:id="238">
     <w:p>
       <w:pPr>
         <w:bidi/>
@@ -15632,31 +15691,31 @@
       </w:r>
     </w:p>
   </w:footnote>
-  <w:footnote w:id="237">
-    <w:p>
-      <w:pPr>
-        <w:bidi/>
-        <w:spacing w:after="40" w:line="240"/>
-        <w:jc w:val="both"/>
-      </w:pPr>
-      <w:r>
-        <w:rPr>
-          <w:rStyle w:val="FootnoteReference"/>
-        </w:rPr>
-        <w:footnoteRef/>
-      </w:r>
-      <w:r>
-        <w:rPr>
-          <w:rFonts w:ascii="David" w:cs="David" w:eastAsia="David" w:hAnsi="David"/>
-          <w:sz w:val="20"/>
-          <w:szCs w:val="20"/>
-          <w:rtl/>
-        </w:rPr>
-        <w:t xml:space="preserve"> הרדוף "ויתור, הידברות, בג"ץ", לעיל ה"ש 222, בעמ' 1844.</w:t>
-      </w:r>
-    </w:p>
-  </w:footnote>
-  <w:footnote w:id="238">
+  <w:footnote w:id="239">
+    <w:p>
+      <w:pPr>
+        <w:bidi/>
+        <w:spacing w:after="40" w:line="240"/>
+        <w:jc w:val="both"/>
+      </w:pPr>
+      <w:r>
+        <w:rPr>
+          <w:rStyle w:val="FootnoteReference"/>
+        </w:rPr>
+        <w:footnoteRef/>
+      </w:r>
+      <w:r>
+        <w:rPr>
+          <w:rFonts w:ascii="David" w:cs="David" w:eastAsia="David" w:hAnsi="David"/>
+          <w:sz w:val="20"/>
+          <w:szCs w:val="20"/>
+          <w:rtl/>
+        </w:rPr>
+        <w:t xml:space="preserve"> הרדוף "ויתור, הידברות, בג"ץ", לעיל ה"ש 224, בעמ' 1844.</w:t>
+      </w:r>
+    </w:p>
+  </w:footnote>
+  <w:footnote w:id="240">
     <w:p>
       <w:pPr>
         <w:bidi/>
@@ -15698,7 +15757,7 @@
       </w:r>
     </w:p>
   </w:footnote>
-  <w:footnote w:id="239">
+  <w:footnote w:id="241">
     <w:p>
       <w:pPr>
         <w:bidi/>

</xml_diff>

<commit_message>
Complete Hardof "זכות מפלה" citation from the article PDF
Mechkarei Mishpat 34, 1 (2022); the cited proposition appears at 48-49.

Co-Authored-By: Claude Opus 5.5 <noreply@anthropic.com>
Claude-Session: https://claude.ai/code/session_01E28rxLu3Wa1kQRJF5nPNrT
</commit_message>
<xml_diff>
--- a/academic/seminar/seminar.docx
+++ b/academic/seminar/seminar.docx
@@ -11456,45 +11456,7 @@
           <w:szCs w:val="20"/>
           <w:rtl/>
         </w:rPr>
-        <w:t xml:space="preserve"> </w:t>
-      </w:r>
-      <w:r>
-        <w:rPr>
-          <w:rFonts w:ascii="David" w:cs="David" w:eastAsia="David" w:hAnsi="David"/>
-          <w:sz w:val="20"/>
-          <w:szCs w:val="20"/>
-          <w:shd w:fill="FFF200" w:color="auto" w:val="clear"/>
-          <w:rtl/>
-        </w:rPr>
-        <w:t xml:space="preserve">[כרך]</w:t>
-      </w:r>
-      <w:r>
-        <w:rPr>
-          <w:rFonts w:ascii="David" w:cs="David" w:eastAsia="David" w:hAnsi="David"/>
-          <w:sz w:val="20"/>
-          <w:szCs w:val="20"/>
-          <w:rtl/>
-        </w:rPr>
-        <w:t xml:space="preserve"> </w:t>
-      </w:r>
-      <w:r>
-        <w:rPr>
-          <w:rFonts w:ascii="David" w:cs="David" w:eastAsia="David" w:hAnsi="David"/>
-          <w:sz w:val="20"/>
-          <w:szCs w:val="20"/>
-          <w:shd w:fill="FFF200" w:color="auto" w:val="clear"/>
-          <w:rtl/>
-        </w:rPr>
-        <w:t xml:space="preserve">[עמוד]</w:t>
-      </w:r>
-      <w:r>
-        <w:rPr>
-          <w:rFonts w:ascii="David" w:cs="David" w:eastAsia="David" w:hAnsi="David"/>
-          <w:sz w:val="20"/>
-          <w:szCs w:val="20"/>
-          <w:rtl w:val="false"/>
-        </w:rPr>
-        <w:t xml:space="preserve"> (2023).</w:t>
+        <w:t xml:space="preserve"> לד 1, 49-48 (2022).</w:t>
       </w:r>
     </w:p>
   </w:footnote>

</xml_diff>

<commit_message>
Correct Hardof, forum and Sapir citations from supplied documents
Nevo's catalog shows Hardof's criminal procedure volume is "אשמים", vol.
II (2026), confirms Stern (2026), and gives the forum collection's exact
title and editor. Reword the Sapir sentence to match his text, which
speaks of treatment and rehabilitation frameworks rather than public
participation.

Co-Authored-By: Claude Opus 5.5 <noreply@anthropic.com>
Claude-Session: https://claude.ai/code/session_01E28rxLu3Wa1kQRJF5nPNrT
</commit_message>
<xml_diff>
--- a/academic/seminar/seminar.docx
+++ b/academic/seminar/seminar.docx
@@ -318,7 +318,7 @@
           <w:szCs w:val="24"/>
           <w:rtl/>
         </w:rPr>
-        <w:t xml:space="preserve"> ספיר מזהיר כי הרחבת סמכויות והחמרת ענישה, בלי טיפול בגורמי העומק ובלי שיתוף הציבור הערבי, עלולות להוביל לתוצאות בלתי צודקות מבלי להפחית את הפשיעה.</w:t>
+        <w:t xml:space="preserve"> ספיר מזהיר כי התמקדות בסמכויות חיפוש חדשות, בכוחות שיטור מיוחדים, בהחמרת הענישה ובעונשי מינימום, בלי פתרונות עומק לבעיות החברה הערבית ובלי חיזוק המערכים הטיפוליים והשיקומיים, עלולה להביא לתוצאות לא צודקות ולהחטיא את מטרת הפחתת הפשיעה, ואף להחריף את חוסר האמון במערכות אכיפת החוק.</w:t>
       </w:r>
       <w:r>
         <w:rPr>
@@ -7256,16 +7256,16 @@
           <w:szCs w:val="20"/>
           <w:rtl/>
         </w:rPr>
-        <w:t xml:space="preserve">שינויי המשטר בישראל 2023: אסופת ניירות עמדה</w:t>
-      </w:r>
-      <w:r>
-        <w:rPr>
-          <w:rFonts w:ascii="David" w:cs="David" w:eastAsia="David" w:hAnsi="David"/>
-          <w:sz w:val="20"/>
-          <w:szCs w:val="20"/>
-          <w:rtl w:val="false"/>
-        </w:rPr>
-        <w:t xml:space="preserve"> 591-590 (2026).</w:t>
+        <w:t xml:space="preserve">שינוי המשטר בישראל 2023: אסופת ניירות עמדה</w:t>
+      </w:r>
+      <w:r>
+        <w:rPr>
+          <w:rFonts w:ascii="David" w:cs="David" w:eastAsia="David" w:hAnsi="David"/>
+          <w:sz w:val="20"/>
+          <w:szCs w:val="20"/>
+          <w:rtl/>
+        </w:rPr>
+        <w:t xml:space="preserve"> 591-590 (רונית לוין-שנור עורכת, 2026).</w:t>
       </w:r>
     </w:p>
   </w:footnote>
@@ -7950,35 +7950,34 @@
           <w:szCs w:val="20"/>
           <w:rtl/>
         </w:rPr>
-        <w:t xml:space="preserve">סדר הדין הפלילי</w:t>
-      </w:r>
-      <w:r>
-        <w:rPr>
-          <w:rFonts w:ascii="David" w:cs="David" w:eastAsia="David" w:hAnsi="David"/>
-          <w:sz w:val="20"/>
-          <w:szCs w:val="20"/>
-          <w:rtl/>
-        </w:rPr>
-        <w:t xml:space="preserve"> חלק א (</w:t>
-      </w:r>
-      <w:r>
-        <w:rPr>
-          <w:rFonts w:ascii="David" w:cs="David" w:eastAsia="David" w:hAnsi="David"/>
-          <w:sz w:val="20"/>
-          <w:szCs w:val="20"/>
-          <w:shd w:fill="FFF200" w:color="auto" w:val="clear"/>
-          <w:rtl/>
-        </w:rPr>
-        <w:t xml:space="preserve">[שנה]</w:t>
-      </w:r>
-      <w:r>
-        <w:rPr>
-          <w:rFonts w:ascii="David" w:cs="David" w:eastAsia="David" w:hAnsi="David"/>
-          <w:sz w:val="20"/>
-          <w:szCs w:val="20"/>
-          <w:rtl/>
-        </w:rPr>
-        <w:t xml:space="preserve">).</w:t>
+        <w:t xml:space="preserve">אשמים: טרילוגיה של משפט פלילי</w:t>
+      </w:r>
+      <w:r>
+        <w:rPr>
+          <w:rFonts w:ascii="David" w:cs="David" w:eastAsia="David" w:hAnsi="David"/>
+          <w:sz w:val="20"/>
+          <w:szCs w:val="20"/>
+          <w:rtl/>
+        </w:rPr>
+        <w:t xml:space="preserve"> כרך </w:t>
+      </w:r>
+      <w:r>
+        <w:rPr>
+          <w:rFonts w:ascii="David" w:cs="David" w:eastAsia="David" w:hAnsi="David"/>
+          <w:sz w:val="20"/>
+          <w:szCs w:val="20"/>
+          <w:rtl w:val="false"/>
+        </w:rPr>
+        <w:t xml:space="preserve">II‎</w:t>
+      </w:r>
+      <w:r>
+        <w:rPr>
+          <w:rFonts w:ascii="David" w:cs="David" w:eastAsia="David" w:hAnsi="David"/>
+          <w:sz w:val="20"/>
+          <w:szCs w:val="20"/>
+          <w:rtl/>
+        </w:rPr>
+        <w:t xml:space="preserve">: סדר דין פלילי, חלק א (2026).</w:t>
       </w:r>
     </w:p>
   </w:footnote>
@@ -8936,7 +8935,7 @@
           <w:szCs w:val="20"/>
           <w:rtl/>
         </w:rPr>
-        <w:t xml:space="preserve">סדר הדין הפלילי</w:t>
+        <w:t xml:space="preserve">אשמים</w:t>
       </w:r>
       <w:r>
         <w:rPr>

</xml_diff>

<commit_message>
Add Tel Aviv University logo to the cover page
Also use the faculty's official name, the Buchmann Faculty of Law.

Co-Authored-By: Claude Opus 5.5 <noreply@anthropic.com>
Claude-Session: https://claude.ai/code/session_01E28rxLu3Wa1kQRJF5nPNrT
</commit_message>
<xml_diff>
--- a/academic/seminar/seminar.docx
+++ b/academic/seminar/seminar.docx
@@ -4,6 +4,52 @@
   <w:body>
     <w:p>
       <w:pPr>
+        <w:spacing w:after="360"/>
+        <w:jc w:val="center"/>
+      </w:pPr>
+      <w:r>
+        <w:drawing>
+          <wp:inline distT="0" distB="0" distL="0" distR="0">
+            <wp:extent cx="1428750" cy="1428750"/>
+            <wp:effectExtent t="0" r="0" b="0" l="0"/>
+            <wp:docPr id="1" name="" descr="" title=""/>
+            <wp:cNvGraphicFramePr>
+              <a:graphicFrameLocks xmlns:a="http://schemas.openxmlformats.org/drawingml/2006/main" noChangeAspect="1"/>
+            </wp:cNvGraphicFramePr>
+            <a:graphic xmlns:a="http://schemas.openxmlformats.org/drawingml/2006/main">
+              <a:graphicData uri="http://schemas.openxmlformats.org/drawingml/2006/picture">
+                <pic:pic xmlns:pic="http://schemas.openxmlformats.org/drawingml/2006/picture">
+                  <pic:nvPicPr>
+                    <pic:cNvPr id="0" name="" descr=""/>
+                    <pic:cNvPicPr>
+                      <a:picLocks noChangeAspect="1" noChangeArrowheads="1"/>
+                    </pic:cNvPicPr>
+                  </pic:nvPicPr>
+                  <pic:blipFill>
+                    <a:blip r:embed="rId8" cstate="none"/>
+                    <a:srcRect/>
+                    <a:stretch>
+                      <a:fillRect/>
+                    </a:stretch>
+                  </pic:blipFill>
+                  <pic:spPr bwMode="auto">
+                    <a:xfrm>
+                      <a:off x="0" y="0"/>
+                      <a:ext cx="1428750" cy="1428750"/>
+                    </a:xfrm>
+                    <a:prstGeom prst="rect">
+                      <a:avLst/>
+                    </a:prstGeom>
+                  </pic:spPr>
+                </pic:pic>
+              </a:graphicData>
+            </a:graphic>
+          </wp:inline>
+        </w:drawing>
+      </w:r>
+    </w:p>
+    <w:p>
+      <w:pPr>
         <w:bidi/>
         <w:spacing w:after="120"/>
         <w:jc w:val="center"/>
@@ -19,7 +65,7 @@
           <w:rtl/>
           <w:lang w:bidi="he-IL"/>
         </w:rPr>
-        <w:t xml:space="preserve">הפקולטה למשפטים</w:t>
+        <w:t xml:space="preserve">הפקולטה למשפטים ע"ש בוכמן</w:t>
       </w:r>
     </w:p>
     <w:p>
@@ -65,7 +111,7 @@
     <w:p>
       <w:pPr>
         <w:bidi/>
-        <w:spacing w:after="1800"/>
+        <w:spacing w:after="1200"/>
         <w:jc w:val="center"/>
       </w:pPr>
       <w:r>
@@ -123,7 +169,7 @@
     <w:p>
       <w:pPr>
         <w:bidi/>
-        <w:spacing w:after="2000"/>
+        <w:spacing w:after="1400"/>
         <w:jc w:val="center"/>
       </w:pPr>
       <w:r>

</xml_diff>